<commit_message>
Atualizado planilha de gestao de testes
</commit_message>
<xml_diff>
--- a/arquivos/Gestão de Testes/Planejamento e Estrategia de Testes.docx
+++ b/arquivos/Gestão de Testes/Planejamento e Estrategia de Testes.docx
@@ -802,14 +802,7 @@
           <w:sz w:val="20"/>
           <w:lang w:val="pt-BR"/>
         </w:rPr>
-        <w:t>Agosto</w:t>
-      </w:r>
-      <w:r>
-        <w:rPr>
-          <w:sz w:val="20"/>
-          <w:lang w:val="pt-BR"/>
-        </w:rPr>
-        <w:t xml:space="preserve"> / 2023 </w:t>
+        <w:t>Agosto / 2023 </w:t>
       </w:r>
     </w:p>
     <w:p>
@@ -836,16 +829,16 @@
         </w:tblCellMar>
       </w:tblPr>
       <w:tblGrid>
-        <w:gridCol w:w="2303"/>
-        <w:gridCol w:w="1152"/>
-        <w:gridCol w:w="3745"/>
-        <w:gridCol w:w="2303"/>
+        <w:gridCol w:w="2301"/>
+        <w:gridCol w:w="1154"/>
+        <w:gridCol w:w="3747"/>
+        <w:gridCol w:w="2301"/>
       </w:tblGrid>
       <w:tr>
         <w:trPr/>
         <w:tc>
           <w:tcPr>
-            <w:tcW w:w="2303" w:type="dxa"/>
+            <w:tcW w:w="2301" w:type="dxa"/>
             <w:tcBorders>
               <w:top w:val="single" w:sz="6" w:space="0" w:color="000000"/>
               <w:start w:val="single" w:sz="6" w:space="0" w:color="000000"/>
@@ -874,7 +867,7 @@
         </w:tc>
         <w:tc>
           <w:tcPr>
-            <w:tcW w:w="1152" w:type="dxa"/>
+            <w:tcW w:w="1154" w:type="dxa"/>
             <w:tcBorders>
               <w:top w:val="single" w:sz="6" w:space="0" w:color="000000"/>
               <w:start w:val="single" w:sz="6" w:space="0" w:color="000000"/>
@@ -903,7 +896,7 @@
         </w:tc>
         <w:tc>
           <w:tcPr>
-            <w:tcW w:w="3745" w:type="dxa"/>
+            <w:tcW w:w="3747" w:type="dxa"/>
             <w:tcBorders>
               <w:top w:val="single" w:sz="6" w:space="0" w:color="000000"/>
               <w:start w:val="single" w:sz="6" w:space="0" w:color="000000"/>
@@ -932,7 +925,7 @@
         </w:tc>
         <w:tc>
           <w:tcPr>
-            <w:tcW w:w="2303" w:type="dxa"/>
+            <w:tcW w:w="2301" w:type="dxa"/>
             <w:tcBorders>
               <w:top w:val="single" w:sz="6" w:space="0" w:color="000000"/>
               <w:start w:val="single" w:sz="6" w:space="0" w:color="000000"/>
@@ -964,7 +957,7 @@
         <w:trPr/>
         <w:tc>
           <w:tcPr>
-            <w:tcW w:w="2303" w:type="dxa"/>
+            <w:tcW w:w="2301" w:type="dxa"/>
             <w:tcBorders>
               <w:top w:val="single" w:sz="6" w:space="0" w:color="000000"/>
               <w:start w:val="single" w:sz="6" w:space="0" w:color="000000"/>
@@ -984,37 +977,13 @@
               <w:rPr>
                 <w:lang w:val="pt-BR"/>
               </w:rPr>
-              <w:t>&lt;</w:t>
-            </w:r>
-            <w:r>
-              <w:rPr>
-                <w:lang w:val="pt-BR"/>
-              </w:rPr>
-              <w:t>31</w:t>
-            </w:r>
-            <w:r>
-              <w:rPr>
-                <w:lang w:val="pt-BR"/>
-              </w:rPr>
-              <w:t>/</w:t>
-            </w:r>
-            <w:r>
-              <w:rPr>
-                <w:lang w:val="pt-BR"/>
-              </w:rPr>
-              <w:t>ago</w:t>
-            </w:r>
-            <w:r>
-              <w:rPr>
-                <w:lang w:val="pt-BR"/>
-              </w:rPr>
-              <w:t>/23&gt;</w:t>
-            </w:r>
-          </w:p>
-        </w:tc>
-        <w:tc>
-          <w:tcPr>
-            <w:tcW w:w="1152" w:type="dxa"/>
+              <w:t>&lt;31/ago/23&gt;</w:t>
+            </w:r>
+          </w:p>
+        </w:tc>
+        <w:tc>
+          <w:tcPr>
+            <w:tcW w:w="1154" w:type="dxa"/>
             <w:tcBorders>
               <w:top w:val="single" w:sz="6" w:space="0" w:color="000000"/>
               <w:start w:val="single" w:sz="6" w:space="0" w:color="000000"/>
@@ -1040,7 +1009,7 @@
         </w:tc>
         <w:tc>
           <w:tcPr>
-            <w:tcW w:w="3745" w:type="dxa"/>
+            <w:tcW w:w="3747" w:type="dxa"/>
             <w:tcBorders>
               <w:top w:val="single" w:sz="6" w:space="0" w:color="000000"/>
               <w:start w:val="single" w:sz="6" w:space="0" w:color="000000"/>
@@ -1066,7 +1035,7 @@
         </w:tc>
         <w:tc>
           <w:tcPr>
-            <w:tcW w:w="2303" w:type="dxa"/>
+            <w:tcW w:w="2301" w:type="dxa"/>
             <w:tcBorders>
               <w:top w:val="single" w:sz="6" w:space="0" w:color="000000"/>
               <w:start w:val="single" w:sz="6" w:space="0" w:color="000000"/>
@@ -1178,17 +1147,8 @@
             <w:tab/>
             <w:t>Introdução</w:t>
             <w:tab/>
+            <w:t>5</w:t>
           </w:r>
-          <w:hyperlink w:anchor="__RefHeading___Toc78907472">
-            <w:r>
-              <w:rPr>
-                <w:rStyle w:val="Vnculodendice"/>
-                <w:sz w:val="22"/>
-                <w:lang w:val="pt-BR" w:eastAsia="pt-BR"/>
-              </w:rPr>
-              <w:t>4</w:t>
-            </w:r>
-          </w:hyperlink>
         </w:p>
         <w:p>
           <w:pPr>
@@ -1209,17 +1169,8 @@
             <w:tab/>
             <w:t>Objetivos</w:t>
             <w:tab/>
+            <w:t>5</w:t>
           </w:r>
-          <w:hyperlink w:anchor="__RefHeading___Toc78907473">
-            <w:r>
-              <w:rPr>
-                <w:rStyle w:val="Vnculodendice"/>
-                <w:sz w:val="22"/>
-                <w:lang w:val="pt-BR" w:eastAsia="pt-BR"/>
-              </w:rPr>
-              <w:t>4</w:t>
-            </w:r>
-          </w:hyperlink>
         </w:p>
         <w:p>
           <w:pPr>
@@ -1240,17 +1191,8 @@
             <w:tab/>
             <w:t>O Swag Labs</w:t>
             <w:tab/>
+            <w:t>5</w:t>
           </w:r>
-          <w:hyperlink w:anchor="__RefHeading___Toc78907474">
-            <w:r>
-              <w:rPr>
-                <w:rStyle w:val="Vnculodendice"/>
-                <w:sz w:val="22"/>
-                <w:lang w:val="pt-BR" w:eastAsia="pt-BR"/>
-              </w:rPr>
-              <w:t>4</w:t>
-            </w:r>
-          </w:hyperlink>
         </w:p>
         <w:p>
           <w:pPr>
@@ -1271,17 +1213,8 @@
             <w:tab/>
             <w:t>Escopo</w:t>
             <w:tab/>
+            <w:t>5</w:t>
           </w:r>
-          <w:hyperlink w:anchor="__RefHeading___Toc78907475">
-            <w:r>
-              <w:rPr>
-                <w:rStyle w:val="Vnculodendice"/>
-                <w:sz w:val="22"/>
-                <w:lang w:val="pt-BR" w:eastAsia="pt-BR"/>
-              </w:rPr>
-              <w:t>4</w:t>
-            </w:r>
-          </w:hyperlink>
         </w:p>
         <w:p>
           <w:pPr>
@@ -1302,17 +1235,8 @@
             <w:tab/>
             <w:t>Identificação de Projeto</w:t>
             <w:tab/>
+            <w:t>6</w:t>
           </w:r>
-          <w:hyperlink w:anchor="__RefHeading___Toc78907476">
-            <w:r>
-              <w:rPr>
-                <w:rStyle w:val="Vnculodendice"/>
-                <w:sz w:val="22"/>
-                <w:lang w:val="pt-BR" w:eastAsia="pt-BR"/>
-              </w:rPr>
-              <w:t>5</w:t>
-            </w:r>
-          </w:hyperlink>
         </w:p>
         <w:p>
           <w:pPr>
@@ -1333,17 +1257,8 @@
             <w:tab/>
             <w:t>Requisitos a Testar</w:t>
             <w:tab/>
+            <w:t>7</w:t>
           </w:r>
-          <w:hyperlink w:anchor="__RefHeading___Toc78907477">
-            <w:r>
-              <w:rPr>
-                <w:rStyle w:val="Vnculodendice"/>
-                <w:sz w:val="22"/>
-                <w:lang w:val="pt-BR" w:eastAsia="pt-BR"/>
-              </w:rPr>
-              <w:t>6</w:t>
-            </w:r>
-          </w:hyperlink>
         </w:p>
         <w:p>
           <w:pPr>
@@ -1364,17 +1279,8 @@
             <w:tab/>
             <w:t>Teste do Banco de Dados</w:t>
             <w:tab/>
+            <w:t>7</w:t>
           </w:r>
-          <w:hyperlink w:anchor="__RefHeading___Toc78907478">
-            <w:r>
-              <w:rPr>
-                <w:rStyle w:val="Vnculodendice"/>
-                <w:sz w:val="22"/>
-                <w:lang w:val="pt-BR" w:eastAsia="pt-BR"/>
-              </w:rPr>
-              <w:t>6</w:t>
-            </w:r>
-          </w:hyperlink>
         </w:p>
         <w:p>
           <w:pPr>
@@ -1395,17 +1301,8 @@
             <w:tab/>
             <w:t>Teste Funcional</w:t>
             <w:tab/>
+            <w:t>7</w:t>
           </w:r>
-          <w:hyperlink w:anchor="__RefHeading___Toc78907479">
-            <w:r>
-              <w:rPr>
-                <w:rStyle w:val="Vnculodendice"/>
-                <w:sz w:val="22"/>
-                <w:lang w:val="pt-BR" w:eastAsia="pt-BR"/>
-              </w:rPr>
-              <w:t>6</w:t>
-            </w:r>
-          </w:hyperlink>
         </w:p>
         <w:p>
           <w:pPr>
@@ -1426,17 +1323,8 @@
             <w:tab/>
             <w:t>Teste do Ciclo de Negócios</w:t>
             <w:tab/>
+            <w:t>7</w:t>
           </w:r>
-          <w:hyperlink w:anchor="__RefHeading___Toc78907480">
-            <w:r>
-              <w:rPr>
-                <w:rStyle w:val="Vnculodendice"/>
-                <w:sz w:val="22"/>
-                <w:lang w:val="pt-BR" w:eastAsia="pt-BR"/>
-              </w:rPr>
-              <w:t>6</w:t>
-            </w:r>
-          </w:hyperlink>
         </w:p>
         <w:p>
           <w:pPr>
@@ -1457,17 +1345,8 @@
             <w:tab/>
             <w:t>Teste da Interface do Usuário</w:t>
             <w:tab/>
+            <w:t>7</w:t>
           </w:r>
-          <w:hyperlink w:anchor="__RefHeading___Toc78907481">
-            <w:r>
-              <w:rPr>
-                <w:rStyle w:val="Vnculodendice"/>
-                <w:sz w:val="22"/>
-                <w:lang w:val="pt-BR" w:eastAsia="pt-BR"/>
-              </w:rPr>
-              <w:t>6</w:t>
-            </w:r>
-          </w:hyperlink>
         </w:p>
         <w:p>
           <w:pPr>
@@ -1488,17 +1367,8 @@
             <w:tab/>
             <w:t>Perfil da Performance</w:t>
             <w:tab/>
+            <w:t>8</w:t>
           </w:r>
-          <w:hyperlink w:anchor="__RefHeading___Toc78907482">
-            <w:r>
-              <w:rPr>
-                <w:rStyle w:val="Vnculodendice"/>
-                <w:sz w:val="22"/>
-                <w:lang w:val="pt-BR" w:eastAsia="pt-BR"/>
-              </w:rPr>
-              <w:t>7</w:t>
-            </w:r>
-          </w:hyperlink>
         </w:p>
         <w:p>
           <w:pPr>
@@ -1519,17 +1389,8 @@
             <w:tab/>
             <w:t>Teste de Carga</w:t>
             <w:tab/>
+            <w:t>8</w:t>
           </w:r>
-          <w:hyperlink w:anchor="__RefHeading___Toc78907483">
-            <w:r>
-              <w:rPr>
-                <w:rStyle w:val="Vnculodendice"/>
-                <w:sz w:val="22"/>
-                <w:lang w:val="pt-BR" w:eastAsia="pt-BR"/>
-              </w:rPr>
-              <w:t>7</w:t>
-            </w:r>
-          </w:hyperlink>
         </w:p>
         <w:p>
           <w:pPr>
@@ -1550,17 +1411,8 @@
             <w:tab/>
             <w:t>Teste de Stress</w:t>
             <w:tab/>
+            <w:t>8</w:t>
           </w:r>
-          <w:hyperlink w:anchor="__RefHeading___Toc78907484">
-            <w:r>
-              <w:rPr>
-                <w:rStyle w:val="Vnculodendice"/>
-                <w:sz w:val="22"/>
-                <w:lang w:val="pt-BR" w:eastAsia="pt-BR"/>
-              </w:rPr>
-              <w:t>7</w:t>
-            </w:r>
-          </w:hyperlink>
         </w:p>
         <w:p>
           <w:pPr>
@@ -1581,17 +1433,8 @@
             <w:tab/>
             <w:t>Teste de Volume</w:t>
             <w:tab/>
+            <w:t>8</w:t>
           </w:r>
-          <w:hyperlink w:anchor="__RefHeading___Toc78907485">
-            <w:r>
-              <w:rPr>
-                <w:rStyle w:val="Vnculodendice"/>
-                <w:sz w:val="22"/>
-                <w:lang w:val="pt-BR" w:eastAsia="pt-BR"/>
-              </w:rPr>
-              <w:t>7</w:t>
-            </w:r>
-          </w:hyperlink>
         </w:p>
         <w:p>
           <w:pPr>
@@ -1612,17 +1455,8 @@
             <w:tab/>
             <w:t>Teste de Segurança e de Controle de Acesso</w:t>
             <w:tab/>
+            <w:t>8</w:t>
           </w:r>
-          <w:hyperlink w:anchor="__RefHeading___Toc78907486">
-            <w:r>
-              <w:rPr>
-                <w:rStyle w:val="Vnculodendice"/>
-                <w:sz w:val="22"/>
-                <w:lang w:val="pt-BR" w:eastAsia="pt-BR"/>
-              </w:rPr>
-              <w:t>7</w:t>
-            </w:r>
-          </w:hyperlink>
         </w:p>
         <w:p>
           <w:pPr>
@@ -1643,17 +1477,8 @@
             <w:tab/>
             <w:t>Teste de Falha/Recuperação</w:t>
             <w:tab/>
+            <w:t>8</w:t>
           </w:r>
-          <w:hyperlink w:anchor="__RefHeading___Toc78907487">
-            <w:r>
-              <w:rPr>
-                <w:rStyle w:val="Vnculodendice"/>
-                <w:sz w:val="22"/>
-                <w:lang w:val="pt-BR" w:eastAsia="pt-BR"/>
-              </w:rPr>
-              <w:t>7</w:t>
-            </w:r>
-          </w:hyperlink>
         </w:p>
         <w:p>
           <w:pPr>
@@ -1672,32 +1497,10 @@
             </w:rPr>
             <w:t>2.11</w:t>
             <w:tab/>
-            <w:t xml:space="preserve">Teste de </w:t>
+            <w:t>Teste de Ambiente</w:t>
+            <w:tab/>
+            <w:t>8</w:t>
           </w:r>
-          <w:r>
-            <w:rPr>
-              <w:sz w:val="22"/>
-              <w:lang w:val="pt-BR" w:eastAsia="pt-BR"/>
-            </w:rPr>
-            <w:t>Ambiente</w:t>
-          </w:r>
-          <w:r>
-            <w:rPr>
-              <w:sz w:val="22"/>
-              <w:lang w:val="pt-BR" w:eastAsia="pt-BR"/>
-            </w:rPr>
-            <w:tab/>
-          </w:r>
-          <w:hyperlink w:anchor="__RefHeading___Toc78907488">
-            <w:r>
-              <w:rPr>
-                <w:rStyle w:val="Vnculodendice"/>
-                <w:sz w:val="22"/>
-                <w:lang w:val="pt-BR" w:eastAsia="pt-BR"/>
-              </w:rPr>
-              <w:t>7</w:t>
-            </w:r>
-          </w:hyperlink>
         </w:p>
         <w:p>
           <w:pPr>
@@ -1718,17 +1521,8 @@
             <w:tab/>
             <w:t>Estratégia de Teste</w:t>
             <w:tab/>
+            <w:t>9</w:t>
           </w:r>
-          <w:hyperlink w:anchor="__RefHeading___Toc78907489">
-            <w:r>
-              <w:rPr>
-                <w:rStyle w:val="Vnculodendice"/>
-                <w:sz w:val="22"/>
-                <w:lang w:val="pt-BR" w:eastAsia="pt-BR"/>
-              </w:rPr>
-              <w:t>8</w:t>
-            </w:r>
-          </w:hyperlink>
         </w:p>
         <w:p>
           <w:pPr>
@@ -1749,17 +1543,8 @@
             <w:tab/>
             <w:t>Tipos de Teste</w:t>
             <w:tab/>
+            <w:t>9</w:t>
           </w:r>
-          <w:hyperlink w:anchor="__RefHeading___Toc78907490">
-            <w:r>
-              <w:rPr>
-                <w:rStyle w:val="Vnculodendice"/>
-                <w:sz w:val="22"/>
-                <w:lang w:val="pt-BR" w:eastAsia="pt-BR"/>
-              </w:rPr>
-              <w:t>8</w:t>
-            </w:r>
-          </w:hyperlink>
         </w:p>
         <w:p>
           <w:pPr>
@@ -1780,17 +1565,8 @@
             <w:tab/>
             <w:t>Teste de Integridade de Dados e do Banco de Dados</w:t>
             <w:tab/>
+            <w:t>9</w:t>
           </w:r>
-          <w:hyperlink w:anchor="__RefHeading___Toc78907491">
-            <w:r>
-              <w:rPr>
-                <w:rStyle w:val="Vnculodendice"/>
-                <w:sz w:val="22"/>
-                <w:lang w:val="pt-BR" w:eastAsia="pt-BR"/>
-              </w:rPr>
-              <w:t>8</w:t>
-            </w:r>
-          </w:hyperlink>
         </w:p>
         <w:p>
           <w:pPr>
@@ -1811,17 +1587,8 @@
             <w:tab/>
             <w:t>Teste de Função</w:t>
             <w:tab/>
+            <w:t>10</w:t>
           </w:r>
-          <w:hyperlink w:anchor="__RefHeading___Toc78907492">
-            <w:r>
-              <w:rPr>
-                <w:rStyle w:val="Vnculodendice"/>
-                <w:sz w:val="22"/>
-                <w:lang w:val="pt-BR" w:eastAsia="pt-BR"/>
-              </w:rPr>
-              <w:t>9</w:t>
-            </w:r>
-          </w:hyperlink>
         </w:p>
         <w:p>
           <w:pPr>
@@ -1842,17 +1609,8 @@
             <w:tab/>
             <w:t>Teste da Interface do Usuário</w:t>
             <w:tab/>
+            <w:t>10</w:t>
           </w:r>
-          <w:hyperlink w:anchor="__RefHeading___Toc78907493">
-            <w:r>
-              <w:rPr>
-                <w:rStyle w:val="Vnculodendice"/>
-                <w:sz w:val="22"/>
-                <w:lang w:val="pt-BR" w:eastAsia="pt-BR"/>
-              </w:rPr>
-              <w:t>9</w:t>
-            </w:r>
-          </w:hyperlink>
         </w:p>
         <w:p>
           <w:pPr>
@@ -1881,9 +1639,16 @@
                 <w:sz w:val="22"/>
                 <w:lang w:val="pt-BR" w:eastAsia="pt-BR"/>
               </w:rPr>
-              <w:t>10</w:t>
+              <w:t>1</w:t>
             </w:r>
           </w:hyperlink>
+          <w:r>
+            <w:rPr>
+              <w:sz w:val="22"/>
+              <w:lang w:val="pt-BR" w:eastAsia="pt-BR"/>
+            </w:rPr>
+            <w:t>1</w:t>
+          </w:r>
         </w:p>
         <w:p>
           <w:pPr>
@@ -1912,9 +1677,16 @@
                 <w:sz w:val="22"/>
                 <w:lang w:val="pt-BR" w:eastAsia="pt-BR"/>
               </w:rPr>
-              <w:t>11</w:t>
+              <w:t>1</w:t>
             </w:r>
           </w:hyperlink>
+          <w:r>
+            <w:rPr>
+              <w:sz w:val="22"/>
+              <w:lang w:val="pt-BR" w:eastAsia="pt-BR"/>
+            </w:rPr>
+            <w:t>3</w:t>
+          </w:r>
         </w:p>
         <w:p>
           <w:pPr>
@@ -1943,9 +1715,16 @@
                 <w:sz w:val="22"/>
                 <w:lang w:val="pt-BR" w:eastAsia="pt-BR"/>
               </w:rPr>
-              <w:t>11</w:t>
+              <w:t>1</w:t>
             </w:r>
           </w:hyperlink>
+          <w:r>
+            <w:rPr>
+              <w:sz w:val="22"/>
+              <w:lang w:val="pt-BR" w:eastAsia="pt-BR"/>
+            </w:rPr>
+            <w:t>3</w:t>
+          </w:r>
         </w:p>
         <w:p>
           <w:pPr>
@@ -1964,32 +1743,26 @@
             </w:rPr>
             <w:t>3.1.7</w:t>
             <w:tab/>
-            <w:t xml:space="preserve">Teste de </w:t>
+            <w:t>Teste de Ambiente</w:t>
+            <w:tab/>
           </w:r>
+          <w:hyperlink w:anchor="__RefHeading___Toc78907497">
+            <w:r>
+              <w:rPr>
+                <w:rStyle w:val="Vnculodendice"/>
+                <w:sz w:val="22"/>
+                <w:lang w:val="pt-BR" w:eastAsia="pt-BR"/>
+              </w:rPr>
+              <w:t>1</w:t>
+            </w:r>
+          </w:hyperlink>
           <w:r>
             <w:rPr>
               <w:sz w:val="22"/>
               <w:lang w:val="pt-BR" w:eastAsia="pt-BR"/>
             </w:rPr>
-            <w:t>Ambiente</w:t>
+            <w:t>4</w:t>
           </w:r>
-          <w:r>
-            <w:rPr>
-              <w:sz w:val="22"/>
-              <w:lang w:val="pt-BR" w:eastAsia="pt-BR"/>
-            </w:rPr>
-            <w:tab/>
-          </w:r>
-          <w:hyperlink w:anchor="__RefHeading___Toc78907497">
-            <w:r>
-              <w:rPr>
-                <w:rStyle w:val="Vnculodendice"/>
-                <w:sz w:val="22"/>
-                <w:lang w:val="pt-BR" w:eastAsia="pt-BR"/>
-              </w:rPr>
-              <w:t>12</w:t>
-            </w:r>
-          </w:hyperlink>
         </w:p>
         <w:p>
           <w:pPr>
@@ -2018,9 +1791,16 @@
                 <w:sz w:val="22"/>
                 <w:lang w:val="pt-BR" w:eastAsia="pt-BR"/>
               </w:rPr>
-              <w:t>12</w:t>
+              <w:t>1</w:t>
             </w:r>
           </w:hyperlink>
+          <w:r>
+            <w:rPr>
+              <w:sz w:val="22"/>
+              <w:lang w:val="pt-BR" w:eastAsia="pt-BR"/>
+            </w:rPr>
+            <w:t>4</w:t>
+          </w:r>
         </w:p>
         <w:p>
           <w:pPr>
@@ -2049,9 +1829,16 @@
                 <w:sz w:val="22"/>
                 <w:lang w:val="pt-BR" w:eastAsia="pt-BR"/>
               </w:rPr>
-              <w:t>13</w:t>
+              <w:t>1</w:t>
             </w:r>
           </w:hyperlink>
+          <w:r>
+            <w:rPr>
+              <w:sz w:val="22"/>
+              <w:lang w:val="pt-BR" w:eastAsia="pt-BR"/>
+            </w:rPr>
+            <w:t>5</w:t>
+          </w:r>
         </w:p>
         <w:p>
           <w:pPr>
@@ -2080,9 +1867,16 @@
                 <w:sz w:val="22"/>
                 <w:lang w:val="pt-BR" w:eastAsia="pt-BR"/>
               </w:rPr>
-              <w:t>13</w:t>
+              <w:t>1</w:t>
             </w:r>
           </w:hyperlink>
+          <w:r>
+            <w:rPr>
+              <w:sz w:val="22"/>
+              <w:lang w:val="pt-BR" w:eastAsia="pt-BR"/>
+            </w:rPr>
+            <w:t>5</w:t>
+          </w:r>
         </w:p>
         <w:p>
           <w:pPr>
@@ -2111,9 +1905,16 @@
                 <w:sz w:val="22"/>
                 <w:lang w:val="pt-BR" w:eastAsia="pt-BR"/>
               </w:rPr>
-              <w:t>14</w:t>
+              <w:t>1</w:t>
             </w:r>
           </w:hyperlink>
+          <w:r>
+            <w:rPr>
+              <w:sz w:val="22"/>
+              <w:lang w:val="pt-BR" w:eastAsia="pt-BR"/>
+            </w:rPr>
+            <w:t>6</w:t>
+          </w:r>
         </w:p>
         <w:p>
           <w:pPr>
@@ -2142,12 +1943,18 @@
                 <w:sz w:val="22"/>
                 <w:lang w:val="pt-BR" w:eastAsia="pt-BR"/>
               </w:rPr>
-              <w:t>15</w:t>
+              <w:t>1</w:t>
             </w:r>
           </w:hyperlink>
           <w:r>
             <w:rPr>
-              <w:rStyle w:val="Vnculodendice"/>
+              <w:sz w:val="22"/>
+              <w:lang w:val="pt-BR" w:eastAsia="pt-BR"/>
+            </w:rPr>
+            <w:t>7</w:t>
+          </w:r>
+          <w:r>
+            <w:rPr>
               <w:sz w:val="22"/>
               <w:lang w:val="pt-BR" w:eastAsia="pt-BR"/>
             </w:rPr>
@@ -2284,21 +2091,7 @@
           <w:sz w:val="22"/>
           <w:lang w:val="pt-BR"/>
         </w:rPr>
-        <w:t xml:space="preserve">Esse documento do Plano de Testes do </w:t>
-      </w:r>
-      <w:r>
-        <w:rPr>
-          <w:sz w:val="22"/>
-          <w:lang w:val="pt-BR"/>
-        </w:rPr>
-        <w:t>Swag Labs</w:t>
-      </w:r>
-      <w:r>
-        <w:rPr>
-          <w:sz w:val="22"/>
-          <w:lang w:val="pt-BR"/>
-        </w:rPr>
-        <w:t xml:space="preserve"> compõe-se dos seguintes objetivos:</w:t>
+        <w:t>Esse documento do Plano de Testes do Swag Labs compõe-se dos seguintes objetivos:</w:t>
       </w:r>
     </w:p>
     <w:p>
@@ -2464,35 +2257,7 @@
           <w:sz w:val="22"/>
           <w:lang w:val="pt-BR"/>
         </w:rPr>
-        <w:t xml:space="preserve">O </w:t>
-      </w:r>
-      <w:r>
-        <w:rPr>
-          <w:sz w:val="22"/>
-          <w:lang w:val="pt-BR"/>
-        </w:rPr>
-        <w:t xml:space="preserve">Swag Labs </w:t>
-      </w:r>
-      <w:r>
-        <w:rPr>
-          <w:sz w:val="22"/>
-          <w:lang w:val="pt-BR"/>
-        </w:rPr>
-        <w:t xml:space="preserve">consiste em um sistema de </w:t>
-      </w:r>
-      <w:r>
-        <w:rPr>
-          <w:sz w:val="22"/>
-          <w:lang w:val="pt-BR"/>
-        </w:rPr>
-        <w:t>compras online para produtos de Vestuários, Acessórios e Veículos não motorisados</w:t>
-      </w:r>
-      <w:r>
-        <w:rPr>
-          <w:sz w:val="22"/>
-          <w:lang w:val="pt-BR"/>
-        </w:rPr>
-        <w:t>.</w:t>
+        <w:t>O Swag Labs consiste em um sistema de compras online para produtos de Vestuários, Acessórios e Veículos não motorisados.</w:t>
       </w:r>
     </w:p>
     <w:p>
@@ -2508,70 +2273,7 @@
           <w:sz w:val="22"/>
           <w:lang w:val="pt-BR"/>
         </w:rPr>
-        <w:t>A</w:t>
-      </w:r>
-      <w:r>
-        <w:rPr>
-          <w:sz w:val="22"/>
-          <w:lang w:val="pt-BR"/>
-        </w:rPr>
-        <w:t xml:space="preserve">s informações </w:t>
-      </w:r>
-      <w:r>
-        <w:rPr>
-          <w:sz w:val="22"/>
-          <w:lang w:val="pt-BR"/>
-        </w:rPr>
-        <w:t>dos produtos são</w:t>
-      </w:r>
-      <w:r>
-        <w:rPr>
-          <w:sz w:val="22"/>
-          <w:lang w:val="pt-BR"/>
-        </w:rPr>
-        <w:t xml:space="preserve"> obtid</w:t>
-      </w:r>
-      <w:r>
-        <w:rPr>
-          <w:sz w:val="22"/>
-          <w:lang w:val="pt-BR"/>
-        </w:rPr>
-        <w:t>as</w:t>
-      </w:r>
-      <w:r>
-        <w:rPr>
-          <w:sz w:val="22"/>
-          <w:lang w:val="pt-BR"/>
-        </w:rPr>
-        <w:t xml:space="preserve"> através de um subsistema encarregado de atualizar </w:t>
-      </w:r>
-      <w:r>
-        <w:rPr>
-          <w:sz w:val="22"/>
-          <w:lang w:val="pt-BR"/>
-        </w:rPr>
-        <w:t>a</w:t>
-      </w:r>
-      <w:r>
-        <w:rPr>
-          <w:sz w:val="22"/>
-          <w:lang w:val="pt-BR"/>
-        </w:rPr>
-        <w:t xml:space="preserve"> base de dados do </w:t>
-      </w:r>
-      <w:r>
-        <w:rPr>
-          <w:sz w:val="22"/>
-          <w:lang w:val="pt-BR"/>
-        </w:rPr>
-        <w:t>Swag Labs</w:t>
-      </w:r>
-      <w:r>
-        <w:rPr>
-          <w:sz w:val="22"/>
-          <w:lang w:val="pt-BR"/>
-        </w:rPr>
-        <w:t xml:space="preserve"> constantemente com informações automaticamente consultadas a partir da internet. </w:t>
+        <w:t xml:space="preserve">As informações dos produtos são obtidas através de um subsistema encarregado de atualizar a base de dados do Swag Labs constantemente com informações automaticamente consultadas a partir da internet. </w:t>
       </w:r>
     </w:p>
     <w:p>
@@ -2587,21 +2289,7 @@
           <w:sz w:val="22"/>
           <w:lang w:val="pt-BR"/>
         </w:rPr>
-        <w:t xml:space="preserve">Esta solução é </w:t>
-      </w:r>
-      <w:r>
-        <w:rPr>
-          <w:sz w:val="22"/>
-          <w:lang w:val="pt-BR"/>
-        </w:rPr>
-        <w:t>para ser utilizada na internet, para todos os publicos</w:t>
-      </w:r>
-      <w:r>
-        <w:rPr>
-          <w:sz w:val="22"/>
-          <w:lang w:val="pt-BR"/>
-        </w:rPr>
-        <w:t>.</w:t>
+        <w:t>Esta solução é para ser utilizada na internet, para todos os publicos.</w:t>
       </w:r>
     </w:p>
     <w:p>
@@ -2685,21 +2373,7 @@
           <w:sz w:val="22"/>
           <w:lang w:val="pt-BR"/>
         </w:rPr>
-        <w:t xml:space="preserve">Para a execução dos testes serão utilizadas máquinas o mais idênticas possível </w:t>
-      </w:r>
-      <w:r>
-        <w:rPr>
-          <w:sz w:val="22"/>
-          <w:lang w:val="pt-BR"/>
-        </w:rPr>
-        <w:t>do usuário comum</w:t>
-      </w:r>
-      <w:r>
-        <w:rPr>
-          <w:sz w:val="22"/>
-          <w:lang w:val="pt-BR"/>
-        </w:rPr>
-        <w:t>, em termos de hardware, a fim de garantir a previsibilidade de performance e compatibilidade.</w:t>
+        <w:t>Para a execução dos testes serão utilizadas máquinas o mais idênticas possível do usuário comum, em termos de hardware, a fim de garantir a previsibilidade de performance e compatibilidade.</w:t>
       </w:r>
     </w:p>
     <w:p>
@@ -2715,21 +2389,7 @@
           <w:sz w:val="22"/>
           <w:lang w:val="pt-BR"/>
         </w:rPr>
-        <w:t xml:space="preserve">Os testes mais críticos serão os testes de </w:t>
-      </w:r>
-      <w:r>
-        <w:rPr>
-          <w:sz w:val="22"/>
-          <w:lang w:val="pt-BR"/>
-        </w:rPr>
-        <w:t>pagamento e</w:t>
-      </w:r>
-      <w:r>
-        <w:rPr>
-          <w:sz w:val="22"/>
-          <w:lang w:val="pt-BR"/>
-        </w:rPr>
-        <w:t xml:space="preserve"> banco de dados, que compõe a maior parte do sistema e os de performance:</w:t>
+        <w:t>Os testes mais críticos serão os testes de pagamento e banco de dados, que compõe a maior parte do sistema e os de performance:</w:t>
       </w:r>
     </w:p>
     <w:p>
@@ -2749,21 +2409,7 @@
           <w:sz w:val="22"/>
           <w:lang w:val="pt-BR"/>
         </w:rPr>
-        <w:t xml:space="preserve">Testaremos o tempo de resposta para operações que envolvam dados </w:t>
-      </w:r>
-      <w:r>
-        <w:rPr>
-          <w:sz w:val="22"/>
-          <w:lang w:val="pt-BR"/>
-        </w:rPr>
-        <w:t>bancários.</w:t>
-      </w:r>
-      <w:r>
-        <w:rPr>
-          <w:sz w:val="22"/>
-          <w:lang w:val="pt-BR"/>
-        </w:rPr>
-        <w:t xml:space="preserve"> </w:t>
+        <w:t xml:space="preserve">Testaremos o tempo de resposta para operações que envolvam dados bancários. </w:t>
       </w:r>
     </w:p>
     <w:p>
@@ -2840,7 +2486,10 @@
         </w:rPr>
       </w:pPr>
       <w:r>
-        <w:rPr/>
+        <w:rPr>
+          <w:sz w:val="22"/>
+          <w:lang w:val="pt-BR"/>
+        </w:rPr>
       </w:r>
     </w:p>
     <w:p>
@@ -4281,49 +3930,7 @@
           <w:sz w:val="22"/>
           <w:lang w:val="pt-BR"/>
         </w:rPr>
-        <w:t xml:space="preserve">Verifique que as informações </w:t>
-      </w:r>
-      <w:r>
-        <w:rPr>
-          <w:sz w:val="22"/>
-          <w:lang w:val="pt-BR"/>
-        </w:rPr>
-        <w:t>imagem</w:t>
-      </w:r>
-      <w:r>
-        <w:rPr>
-          <w:sz w:val="22"/>
-          <w:lang w:val="pt-BR"/>
-        </w:rPr>
-        <w:t xml:space="preserve">, </w:t>
-      </w:r>
-      <w:r>
-        <w:rPr>
-          <w:sz w:val="22"/>
-          <w:lang w:val="pt-BR"/>
-        </w:rPr>
-        <w:t>nome</w:t>
-      </w:r>
-      <w:r>
-        <w:rPr>
-          <w:sz w:val="22"/>
-          <w:lang w:val="pt-BR"/>
-        </w:rPr>
-        <w:t xml:space="preserve">, </w:t>
-      </w:r>
-      <w:r>
-        <w:rPr>
-          <w:sz w:val="22"/>
-          <w:lang w:val="pt-BR"/>
-        </w:rPr>
-        <w:t>descrição e preços</w:t>
-      </w:r>
-      <w:r>
-        <w:rPr>
-          <w:sz w:val="22"/>
-          <w:lang w:val="pt-BR"/>
-        </w:rPr>
-        <w:t xml:space="preserve"> podem ser inseridos, atualizados e consultados.</w:t>
+        <w:t>Verifique que as informações imagem, nome, descrição e preços podem ser inseridos, atualizados e consultados.</w:t>
       </w:r>
     </w:p>
     <w:p>
@@ -4398,21 +4005,7 @@
           <w:sz w:val="22"/>
           <w:lang w:val="pt-BR"/>
         </w:rPr>
-        <w:t xml:space="preserve">Verifique que o sistema pode remover categorias de </w:t>
-      </w:r>
-      <w:r>
-        <w:rPr>
-          <w:sz w:val="22"/>
-          <w:lang w:val="pt-BR"/>
-        </w:rPr>
-        <w:t>produtos</w:t>
-      </w:r>
-      <w:r>
-        <w:rPr>
-          <w:sz w:val="22"/>
-          <w:lang w:val="pt-BR"/>
-        </w:rPr>
-        <w:t xml:space="preserve"> cadastrados.</w:t>
+        <w:t>Verifique que o sistema pode remover categorias de produtos cadastrados.</w:t>
       </w:r>
     </w:p>
     <w:p>
@@ -4437,21 +4030,7 @@
           <w:sz w:val="22"/>
           <w:lang w:val="pt-BR"/>
         </w:rPr>
-        <w:t xml:space="preserve">Verifique que um novo </w:t>
-      </w:r>
-      <w:r>
-        <w:rPr>
-          <w:sz w:val="22"/>
-          <w:lang w:val="pt-BR"/>
-        </w:rPr>
-        <w:t>produto</w:t>
-      </w:r>
-      <w:r>
-        <w:rPr>
-          <w:sz w:val="22"/>
-          <w:lang w:val="pt-BR"/>
-        </w:rPr>
-        <w:t xml:space="preserve"> pode ser cadastrado.</w:t>
+        <w:t>Verifique que um novo produto pode ser cadastrado.</w:t>
       </w:r>
     </w:p>
     <w:p>
@@ -4501,21 +4080,7 @@
           <w:sz w:val="22"/>
           <w:lang w:val="pt-BR"/>
         </w:rPr>
-        <w:t xml:space="preserve">Verifique que os </w:t>
-      </w:r>
-      <w:r>
-        <w:rPr>
-          <w:sz w:val="22"/>
-          <w:lang w:val="pt-BR"/>
-        </w:rPr>
-        <w:t>produtos</w:t>
-      </w:r>
-      <w:r>
-        <w:rPr>
-          <w:sz w:val="22"/>
-          <w:lang w:val="pt-BR"/>
-        </w:rPr>
-        <w:t xml:space="preserve"> possam ser cadastrados, removidos e atualizados pelo administrador do sistema.</w:t>
+        <w:t>Verifique que os produtos possam ser cadastrados, removidos e atualizados pelo administrador do sistema.</w:t>
       </w:r>
     </w:p>
     <w:p>
@@ -4553,21 +4118,7 @@
           <w:sz w:val="22"/>
           <w:lang w:val="pt-BR"/>
         </w:rPr>
-        <w:t xml:space="preserve">o </w:t>
-      </w:r>
-      <w:r>
-        <w:rPr>
-          <w:sz w:val="22"/>
-          <w:lang w:val="pt-BR"/>
-        </w:rPr>
-        <w:t>produto</w:t>
-      </w:r>
-      <w:r>
-        <w:rPr>
-          <w:sz w:val="22"/>
-          <w:lang w:val="pt-BR"/>
-        </w:rPr>
-        <w:t xml:space="preserve"> possam ser cadastradas, removidas e atualizadas pelo administrador do sistema.</w:t>
+        <w:t>o produto possam ser cadastradas, removidas e atualizadas pelo administrador do sistema.</w:t>
       </w:r>
     </w:p>
     <w:p>
@@ -4617,21 +4168,7 @@
           <w:sz w:val="22"/>
           <w:lang w:val="pt-BR"/>
         </w:rPr>
-        <w:t xml:space="preserve">Verifique que o usuário cadastrado pode </w:t>
-      </w:r>
-      <w:r>
-        <w:rPr>
-          <w:sz w:val="22"/>
-          <w:lang w:val="pt-BR"/>
-        </w:rPr>
-        <w:t>acessar o carrinho de compras</w:t>
-      </w:r>
-      <w:r>
-        <w:rPr>
-          <w:sz w:val="22"/>
-          <w:lang w:val="pt-BR"/>
-        </w:rPr>
-        <w:t>.</w:t>
+        <w:t>Verifique que o usuário cadastrado pode acessar o carrinho de compras.</w:t>
       </w:r>
     </w:p>
     <w:p>
@@ -4656,21 +4193,7 @@
           <w:sz w:val="22"/>
           <w:lang w:val="pt-BR"/>
         </w:rPr>
-        <w:t xml:space="preserve">Verifique que o sistema é capaz de buscar e manter atualizadas as informações de </w:t>
-      </w:r>
-      <w:r>
-        <w:rPr>
-          <w:sz w:val="22"/>
-          <w:lang w:val="pt-BR"/>
-        </w:rPr>
-        <w:t>compras</w:t>
-      </w:r>
-      <w:r>
-        <w:rPr>
-          <w:sz w:val="22"/>
-          <w:lang w:val="pt-BR"/>
-        </w:rPr>
-        <w:t xml:space="preserve"> de conta.</w:t>
+        <w:t>Verifique que o sistema é capaz de buscar e manter atualizadas as informações de compras de conta.</w:t>
       </w:r>
     </w:p>
     <w:p>
@@ -4768,21 +4291,7 @@
           <w:sz w:val="22"/>
           <w:lang w:val="pt-BR"/>
         </w:rPr>
-        <w:t xml:space="preserve">Verifique que as informações </w:t>
-      </w:r>
-      <w:r>
-        <w:rPr>
-          <w:sz w:val="22"/>
-          <w:lang w:val="pt-BR"/>
-        </w:rPr>
-        <w:t>no idioma em Inglês</w:t>
-      </w:r>
-      <w:r>
-        <w:rPr>
-          <w:sz w:val="22"/>
-          <w:lang w:val="pt-BR"/>
-        </w:rPr>
-        <w:t>.</w:t>
+        <w:t>Verifique que as informações no idioma em Inglês.</w:t>
       </w:r>
     </w:p>
     <w:p>
@@ -4958,21 +4467,7 @@
           <w:sz w:val="22"/>
           <w:lang w:val="pt-BR"/>
         </w:rPr>
-        <w:t xml:space="preserve">Verifique o tempo de resposta da rede </w:t>
-      </w:r>
-      <w:r>
-        <w:rPr>
-          <w:sz w:val="22"/>
-          <w:lang w:val="pt-BR"/>
-        </w:rPr>
-        <w:t>externa</w:t>
-      </w:r>
-      <w:r>
-        <w:rPr>
-          <w:sz w:val="22"/>
-          <w:lang w:val="pt-BR"/>
-        </w:rPr>
-        <w:t>, do servidor em relação aos terminais.</w:t>
+        <w:t>Verifique o tempo de resposta da rede externa, do servidor em relação aos terminais.</w:t>
       </w:r>
     </w:p>
     <w:p>
@@ -5004,21 +4499,7 @@
           <w:sz w:val="22"/>
           <w:lang w:val="pt-BR"/>
         </w:rPr>
-        <w:t xml:space="preserve">Verifique que o tempo de resposta para operações que envolvam dados multimídia (imagens, vídeos, etc.) não ultrapassam </w:t>
-      </w:r>
-      <w:r>
-        <w:rPr>
-          <w:sz w:val="22"/>
-          <w:lang w:val="pt-BR"/>
-        </w:rPr>
-        <w:t>15</w:t>
-      </w:r>
-      <w:r>
-        <w:rPr>
-          <w:sz w:val="22"/>
-          <w:lang w:val="pt-BR"/>
-        </w:rPr>
-        <w:t xml:space="preserve"> segundos.</w:t>
+        <w:t>Verifique que o tempo de resposta para operações que envolvam dados multimídia (imagens, vídeos, etc.) não ultrapassam 15 segundos.</w:t>
       </w:r>
     </w:p>
     <w:p>
@@ -5270,35 +4751,7 @@
           <w:sz w:val="22"/>
           <w:lang w:val="pt-BR"/>
         </w:rPr>
-        <w:t xml:space="preserve">Verificar que os </w:t>
-      </w:r>
-      <w:r>
-        <w:rPr>
-          <w:sz w:val="22"/>
-          <w:lang w:val="pt-BR"/>
-        </w:rPr>
-        <w:t>clientes</w:t>
-      </w:r>
-      <w:r>
-        <w:rPr>
-          <w:sz w:val="22"/>
-          <w:lang w:val="pt-BR"/>
-        </w:rPr>
-        <w:t xml:space="preserve"> apenas vêem suas próprias informações de conta n</w:t>
-      </w:r>
-      <w:r>
-        <w:rPr>
-          <w:sz w:val="22"/>
-          <w:lang w:val="pt-BR"/>
-        </w:rPr>
-        <w:t>a loja virtual</w:t>
-      </w:r>
-      <w:r>
-        <w:rPr>
-          <w:sz w:val="22"/>
-          <w:lang w:val="pt-BR"/>
-        </w:rPr>
-        <w:t>.</w:t>
+        <w:t>Verificar que os clientes apenas vêem suas próprias informações de conta na loja virtual.</w:t>
       </w:r>
     </w:p>
     <w:p>
@@ -5376,14 +4829,7 @@
           <w:sz w:val="22"/>
           <w:lang w:val="pt-BR"/>
         </w:rPr>
-        <w:t xml:space="preserve">Teste de </w:t>
-      </w:r>
-      <w:r>
-        <w:rPr>
-          <w:sz w:val="22"/>
-          <w:lang w:val="pt-BR"/>
-        </w:rPr>
-        <w:t>Ambiente</w:t>
+        <w:t>Teste de Ambiente</w:t>
       </w:r>
     </w:p>
     <w:p>
@@ -5399,14 +4845,7 @@
           <w:sz w:val="22"/>
           <w:lang w:val="pt-BR"/>
         </w:rPr>
-        <w:t>A plataforma deve ser acessada por qualquer navegador como Google Chrome, Microsoft Edge, Safari e Ópera</w:t>
-      </w:r>
-      <w:r>
-        <w:rPr>
-          <w:sz w:val="22"/>
-          <w:lang w:val="pt-BR"/>
-        </w:rPr>
-        <w:t>.</w:t>
+        <w:t>A plataforma deve ser acessada por qualquer navegador como Google Chrome, Microsoft Edge, Safari e Ópera.</w:t>
       </w:r>
       <w:r>
         <w:br w:type="page"/>
@@ -5819,21 +5258,7 @@
                 <w:sz w:val="22"/>
                 <w:lang w:val="pt-BR"/>
               </w:rPr>
-              <w:t>O teste pode necessitar de um ambiente de desenvolvimento ou drivers de SGBD para inserir ou modificar os dados diretamente nas base</w:t>
-            </w:r>
-            <w:r>
-              <w:rPr>
-                <w:sz w:val="22"/>
-                <w:lang w:val="pt-BR"/>
-              </w:rPr>
-              <w:t>s</w:t>
-            </w:r>
-            <w:r>
-              <w:rPr>
-                <w:sz w:val="22"/>
-                <w:lang w:val="pt-BR"/>
-              </w:rPr>
-              <w:t xml:space="preserve"> de dados</w:t>
+              <w:t>O teste pode necessitar de um ambiente de desenvolvimento ou drivers de SGBD para inserir ou modificar os dados diretamente nas bases de dados</w:t>
             </w:r>
           </w:p>
           <w:p>
@@ -8237,21 +7662,7 @@
                 <w:sz w:val="22"/>
                 <w:lang w:val="pt-BR"/>
               </w:rPr>
-              <w:t xml:space="preserve">O Acesso ao sistema deve ser revisado ou discutido com o </w:t>
-            </w:r>
-            <w:r>
-              <w:rPr>
-                <w:sz w:val="22"/>
-                <w:lang w:val="pt-BR"/>
-              </w:rPr>
-              <w:t>a</w:t>
-            </w:r>
-            <w:r>
-              <w:rPr>
-                <w:sz w:val="22"/>
-                <w:lang w:val="pt-BR"/>
-              </w:rPr>
-              <w:t>dministrador de rede ou de sistema apropriado. Esse teste pode não ser necessário já que ele pode ser uma função da administração da rede ou sistema.</w:t>
+              <w:t>O Acesso ao sistema deve ser revisado ou discutido com o administrador de rede ou de sistema apropriado. Esse teste pode não ser necessário já que ele pode ser uma função da administração da rede ou sistema.</w:t>
             </w:r>
           </w:p>
         </w:tc>
@@ -8406,21 +7817,7 @@
                 <w:sz w:val="22"/>
                 <w:lang w:val="pt-BR"/>
               </w:rPr>
-              <w:t xml:space="preserve">Verifique que </w:t>
-            </w:r>
-            <w:r>
-              <w:rPr>
-                <w:sz w:val="22"/>
-                <w:lang w:val="pt-BR"/>
-              </w:rPr>
-              <w:t>o usuário acesse a plataforma apenas por navegadores</w:t>
-            </w:r>
-            <w:r>
-              <w:rPr>
-                <w:sz w:val="22"/>
-                <w:lang w:val="pt-BR"/>
-              </w:rPr>
-              <w:t>:</w:t>
+              <w:t>Verifique que o usuário acesse a plataforma apenas por navegadores:</w:t>
             </w:r>
           </w:p>
           <w:p>
@@ -8446,14 +7843,7 @@
                 <w:sz w:val="22"/>
                 <w:lang w:val="pt-BR"/>
               </w:rPr>
-              <w:t>Google Chrome, Microsoft Edge, Safari e Ópera</w:t>
-            </w:r>
-            <w:r>
-              <w:rPr>
-                <w:sz w:val="22"/>
-                <w:lang w:val="pt-BR"/>
-              </w:rPr>
-              <w:t>.</w:t>
+              <w:t>Google Chrome, Microsoft Edge, Safari e Ópera.</w:t>
             </w:r>
           </w:p>
         </w:tc>
@@ -8517,35 +7907,7 @@
                 <w:sz w:val="22"/>
                 <w:lang w:val="pt-BR"/>
               </w:rPr>
-              <w:t>Manualmente ou desenvolva scripts automatizados, para validar a condição d</w:t>
-            </w:r>
-            <w:r>
-              <w:rPr>
-                <w:sz w:val="22"/>
-                <w:lang w:val="pt-BR"/>
-              </w:rPr>
-              <w:t>o navegador</w:t>
-            </w:r>
-            <w:r>
-              <w:rPr>
-                <w:sz w:val="22"/>
-                <w:lang w:val="pt-BR"/>
-              </w:rPr>
-              <w:t xml:space="preserve">; </w:t>
-            </w:r>
-            <w:r>
-              <w:rPr>
-                <w:sz w:val="22"/>
-                <w:lang w:val="pt-BR"/>
-              </w:rPr>
-              <w:t>Swag Lab</w:t>
-            </w:r>
-            <w:r>
-              <w:rPr>
-                <w:sz w:val="22"/>
-                <w:lang w:val="pt-BR"/>
-              </w:rPr>
-              <w:t xml:space="preserve"> na mesma versão ou versão mais velha já instalada.</w:t>
+              <w:t>Manualmente ou desenvolva scripts automatizados, para validar a condição do navegador; Swag Lab na mesma versão ou versão mais velha já instalada.</w:t>
             </w:r>
           </w:p>
           <w:p>
@@ -8652,21 +8014,7 @@
                 <w:sz w:val="22"/>
                 <w:lang w:val="pt-BR"/>
               </w:rPr>
-              <w:t xml:space="preserve">As transações do </w:t>
-            </w:r>
-            <w:r>
-              <w:rPr>
-                <w:sz w:val="22"/>
-                <w:lang w:val="pt-BR"/>
-              </w:rPr>
-              <w:t>Swag Lab</w:t>
-            </w:r>
-            <w:r>
-              <w:rPr>
-                <w:sz w:val="22"/>
-                <w:lang w:val="pt-BR"/>
-              </w:rPr>
-              <w:t xml:space="preserve"> executam de forma bem-sucedida, sem falha.</w:t>
+              <w:t>As transações do Swag Lab executam de forma bem-sucedida, sem falha.</w:t>
             </w:r>
           </w:p>
         </w:tc>
@@ -8731,35 +8079,7 @@
                 <w:sz w:val="22"/>
                 <w:lang w:val="pt-BR"/>
               </w:rPr>
-              <w:t xml:space="preserve">Quais transações do </w:t>
-            </w:r>
-            <w:r>
-              <w:rPr>
-                <w:sz w:val="22"/>
-                <w:lang w:val="pt-BR"/>
-              </w:rPr>
-              <w:t>Swag Lab</w:t>
-            </w:r>
-            <w:r>
-              <w:rPr>
-                <w:sz w:val="22"/>
-                <w:lang w:val="pt-BR"/>
-              </w:rPr>
-              <w:t xml:space="preserve"> devem ser selecionadas para abranger um teste de confiança de que a aplicação </w:t>
-            </w:r>
-            <w:r>
-              <w:rPr>
-                <w:sz w:val="22"/>
-                <w:lang w:val="pt-BR"/>
-              </w:rPr>
-              <w:t>Swag Lab</w:t>
-            </w:r>
-            <w:r>
-              <w:rPr>
-                <w:sz w:val="22"/>
-                <w:lang w:val="pt-BR"/>
-              </w:rPr>
-              <w:t xml:space="preserve"> foi instalada de forma bem-sucedida e que nenhum componente importante de software está faltando?</w:t>
+              <w:t>Quais transações do Swag Lab devem ser selecionadas para abranger um teste de confiança de que a aplicação Swag Lab foi instalada de forma bem-sucedida e que nenhum componente importante de software está faltando?</w:t>
             </w:r>
           </w:p>
         </w:tc>
@@ -8836,8 +8156,8 @@
       </w:tblPr>
       <w:tblGrid>
         <w:gridCol w:w="3059"/>
-        <w:gridCol w:w="2359"/>
-        <w:gridCol w:w="3195"/>
+        <w:gridCol w:w="2357"/>
+        <w:gridCol w:w="3197"/>
       </w:tblGrid>
       <w:tr>
         <w:trPr/>
@@ -8871,7 +8191,7 @@
         </w:tc>
         <w:tc>
           <w:tcPr>
-            <w:tcW w:w="2359" w:type="dxa"/>
+            <w:tcW w:w="2357" w:type="dxa"/>
             <w:tcBorders>
               <w:top w:val="single" w:sz="12" w:space="0" w:color="000000"/>
               <w:start w:val="single" w:sz="6" w:space="0" w:color="000000"/>
@@ -8900,7 +8220,7 @@
         </w:tc>
         <w:tc>
           <w:tcPr>
-            <w:tcW w:w="3195" w:type="dxa"/>
+            <w:tcW w:w="3197" w:type="dxa"/>
             <w:tcBorders>
               <w:top w:val="single" w:sz="12" w:space="0" w:color="000000"/>
               <w:start w:val="single" w:sz="6" w:space="0" w:color="000000"/>
@@ -8959,7 +8279,7 @@
         </w:tc>
         <w:tc>
           <w:tcPr>
-            <w:tcW w:w="2359" w:type="dxa"/>
+            <w:tcW w:w="2357" w:type="dxa"/>
             <w:tcBorders>
               <w:start w:val="single" w:sz="6" w:space="0" w:color="000000"/>
               <w:bottom w:val="single" w:sz="6" w:space="0" w:color="000000"/>
@@ -8985,7 +8305,7 @@
         </w:tc>
         <w:tc>
           <w:tcPr>
-            <w:tcW w:w="3195" w:type="dxa"/>
+            <w:tcW w:w="3197" w:type="dxa"/>
             <w:tcBorders>
               <w:start w:val="single" w:sz="6" w:space="0" w:color="000000"/>
               <w:bottom w:val="single" w:sz="6" w:space="0" w:color="000000"/>
@@ -9044,7 +8364,7 @@
         </w:tc>
         <w:tc>
           <w:tcPr>
-            <w:tcW w:w="2359" w:type="dxa"/>
+            <w:tcW w:w="2357" w:type="dxa"/>
             <w:tcBorders>
               <w:top w:val="single" w:sz="6" w:space="0" w:color="000000"/>
               <w:start w:val="single" w:sz="6" w:space="0" w:color="000000"/>
@@ -9073,7 +8393,7 @@
         </w:tc>
         <w:tc>
           <w:tcPr>
-            <w:tcW w:w="3195" w:type="dxa"/>
+            <w:tcW w:w="3197" w:type="dxa"/>
             <w:tcBorders>
               <w:top w:val="single" w:sz="6" w:space="0" w:color="000000"/>
               <w:start w:val="single" w:sz="6" w:space="0" w:color="000000"/>
@@ -9133,7 +8453,7 @@
         </w:tc>
         <w:tc>
           <w:tcPr>
-            <w:tcW w:w="2359" w:type="dxa"/>
+            <w:tcW w:w="2357" w:type="dxa"/>
             <w:tcBorders>
               <w:top w:val="single" w:sz="6" w:space="0" w:color="000000"/>
               <w:start w:val="single" w:sz="6" w:space="0" w:color="000000"/>
@@ -9173,20 +8493,13 @@
                 <w:sz w:val="22"/>
                 <w:lang w:val="en-US"/>
               </w:rPr>
-              <w:t xml:space="preserve">Microsoft </w:t>
-            </w:r>
-            <w:r>
-              <w:rPr>
-                <w:sz w:val="22"/>
-                <w:lang w:val="en-US"/>
-              </w:rPr>
-              <w:t>Excel</w:t>
-            </w:r>
-          </w:p>
-        </w:tc>
-        <w:tc>
-          <w:tcPr>
-            <w:tcW w:w="3195" w:type="dxa"/>
+              <w:t>Microsoft Excel</w:t>
+            </w:r>
+          </w:p>
+        </w:tc>
+        <w:tc>
+          <w:tcPr>
+            <w:tcW w:w="3197" w:type="dxa"/>
             <w:tcBorders>
               <w:top w:val="single" w:sz="6" w:space="0" w:color="000000"/>
               <w:start w:val="single" w:sz="6" w:space="0" w:color="000000"/>
@@ -9246,7 +8559,7 @@
         </w:tc>
         <w:tc>
           <w:tcPr>
-            <w:tcW w:w="2359" w:type="dxa"/>
+            <w:tcW w:w="2357" w:type="dxa"/>
             <w:tcBorders>
               <w:top w:val="single" w:sz="6" w:space="0" w:color="000000"/>
               <w:start w:val="single" w:sz="6" w:space="0" w:color="000000"/>
@@ -9275,7 +8588,7 @@
         </w:tc>
         <w:tc>
           <w:tcPr>
-            <w:tcW w:w="3195" w:type="dxa"/>
+            <w:tcW w:w="3197" w:type="dxa"/>
             <w:tcBorders>
               <w:top w:val="single" w:sz="6" w:space="0" w:color="000000"/>
               <w:start w:val="single" w:sz="6" w:space="0" w:color="000000"/>
@@ -9335,7 +8648,7 @@
         </w:tc>
         <w:tc>
           <w:tcPr>
-            <w:tcW w:w="2359" w:type="dxa"/>
+            <w:tcW w:w="2357" w:type="dxa"/>
             <w:tcBorders>
               <w:start w:val="single" w:sz="6" w:space="0" w:color="000000"/>
               <w:bottom w:val="single" w:sz="12" w:space="0" w:color="000000"/>
@@ -9363,7 +8676,7 @@
         </w:tc>
         <w:tc>
           <w:tcPr>
-            <w:tcW w:w="3195" w:type="dxa"/>
+            <w:tcW w:w="3197" w:type="dxa"/>
             <w:tcBorders>
               <w:start w:val="single" w:sz="6" w:space="0" w:color="000000"/>
               <w:bottom w:val="single" w:sz="12" w:space="0" w:color="000000"/>
@@ -9433,21 +8746,7 @@
           <w:sz w:val="22"/>
           <w:lang w:val="pt-BR"/>
         </w:rPr>
-        <w:t xml:space="preserve">Essa seção apresenta os recursos recomendados para o projeto do </w:t>
-      </w:r>
-      <w:r>
-        <w:rPr>
-          <w:sz w:val="22"/>
-          <w:lang w:val="pt-BR"/>
-        </w:rPr>
-        <w:t>Swag Lab</w:t>
-      </w:r>
-      <w:r>
-        <w:rPr>
-          <w:sz w:val="22"/>
-          <w:lang w:val="pt-BR"/>
-        </w:rPr>
-        <w:t>, suas principais responsabilidades, e seus conhecimentos ou conjunto de habilidades.</w:t>
+        <w:t>Essa seção apresenta os recursos recomendados para o projeto do Swag Lab, suas principais responsabilidades, e seus conhecimentos ou conjunto de habilidades.</w:t>
       </w:r>
     </w:p>
     <w:p>
@@ -10076,14 +9375,7 @@
                 <w:sz w:val="22"/>
                 <w:lang w:val="pt-BR"/>
               </w:rPr>
-              <w:t>B</w:t>
-            </w:r>
-            <w:r>
-              <w:rPr>
-                <w:sz w:val="22"/>
-                <w:lang w:val="pt-BR"/>
-              </w:rPr>
-              <w:t>art Simpson</w:t>
+              <w:t>Bart Simpson</w:t>
             </w:r>
           </w:p>
         </w:tc>
@@ -10186,14 +9478,7 @@
                 <w:sz w:val="22"/>
                 <w:lang w:val="pt-BR"/>
               </w:rPr>
-              <w:t>R</w:t>
-            </w:r>
-            <w:r>
-              <w:rPr>
-                <w:sz w:val="22"/>
-                <w:lang w:val="pt-BR"/>
-              </w:rPr>
-              <w:t>eestabelecer-se dos erros</w:t>
+              <w:t>Reestabelecer-se dos erros</w:t>
             </w:r>
           </w:p>
           <w:p>
@@ -11040,23 +10325,7 @@
                 <w:sz w:val="22"/>
                 <w:lang w:val="pt-BR"/>
               </w:rPr>
-              <w:t xml:space="preserve">Sistema operacional: </w:t>
-            </w:r>
-            <w:r>
-              <w:rPr>
-                <w:color w:val="000000"/>
-                <w:sz w:val="22"/>
-                <w:lang w:val="pt-BR"/>
-              </w:rPr>
-              <w:t xml:space="preserve">Windows 10+, MacOS X ou </w:t>
-            </w:r>
-            <w:r>
-              <w:rPr>
-                <w:color w:val="000000"/>
-                <w:sz w:val="22"/>
-                <w:lang w:val="pt-BR"/>
-              </w:rPr>
-              <w:t>Ubuntu</w:t>
+              <w:t>Sistema operacional: Windows 10+, MacOS X ou Ubuntu</w:t>
             </w:r>
           </w:p>
         </w:tc>
@@ -11090,21 +10359,7 @@
                 <w:sz w:val="22"/>
                 <w:lang w:val="pt-BR"/>
               </w:rPr>
-              <w:t xml:space="preserve">Navegador: </w:t>
-            </w:r>
-            <w:r>
-              <w:rPr>
-                <w:sz w:val="22"/>
-                <w:lang w:val="pt-BR"/>
-              </w:rPr>
-              <w:t>Google Chrome, Microsoft Edge, Safari e Ópera</w:t>
-            </w:r>
-            <w:r>
-              <w:rPr>
-                <w:sz w:val="22"/>
-                <w:lang w:val="pt-BR"/>
-              </w:rPr>
-              <w:t>.</w:t>
+              <w:t>Navegador: Google Chrome, Microsoft Edge, Safari e Ópera.</w:t>
             </w:r>
           </w:p>
           <w:p>
@@ -11125,14 +10380,7 @@
                 <w:sz w:val="22"/>
                 <w:lang w:val="pt-BR"/>
               </w:rPr>
-              <w:t xml:space="preserve">Linguagem de programação: </w:t>
-            </w:r>
-            <w:r>
-              <w:rPr>
-                <w:sz w:val="22"/>
-                <w:lang w:val="pt-BR"/>
-              </w:rPr>
-              <w:t>Java JDK 8+</w:t>
+              <w:t>Linguagem de programação: Java JDK 8+</w:t>
             </w:r>
           </w:p>
           <w:p>
@@ -11441,28 +10689,7 @@
                 <w:sz w:val="22"/>
                 <w:lang w:val="pt-BR"/>
               </w:rPr>
-              <w:t>19/0</w:t>
-            </w:r>
-            <w:r>
-              <w:rPr>
-                <w:sz w:val="22"/>
-                <w:lang w:val="pt-BR"/>
-              </w:rPr>
-              <w:t>9</w:t>
-            </w:r>
-            <w:r>
-              <w:rPr>
-                <w:sz w:val="22"/>
-                <w:lang w:val="pt-BR"/>
-              </w:rPr>
-              <w:t>/</w:t>
-            </w:r>
-            <w:r>
-              <w:rPr>
-                <w:sz w:val="22"/>
-                <w:lang w:val="pt-BR"/>
-              </w:rPr>
-              <w:t>23</w:t>
+              <w:t>19/09/23</w:t>
             </w:r>
           </w:p>
         </w:tc>
@@ -11491,28 +10718,7 @@
                 <w:sz w:val="22"/>
                 <w:lang w:val="pt-BR"/>
               </w:rPr>
-              <w:t>19/0</w:t>
-            </w:r>
-            <w:r>
-              <w:rPr>
-                <w:sz w:val="22"/>
-                <w:lang w:val="pt-BR"/>
-              </w:rPr>
-              <w:t>9</w:t>
-            </w:r>
-            <w:r>
-              <w:rPr>
-                <w:sz w:val="22"/>
-                <w:lang w:val="pt-BR"/>
-              </w:rPr>
-              <w:t>/</w:t>
-            </w:r>
-            <w:r>
-              <w:rPr>
-                <w:sz w:val="22"/>
-                <w:lang w:val="pt-BR"/>
-              </w:rPr>
-              <w:t>23</w:t>
+              <w:t>19/09/23</w:t>
             </w:r>
           </w:p>
         </w:tc>
@@ -11572,28 +10778,7 @@
                 <w:sz w:val="22"/>
                 <w:lang w:val="pt-BR"/>
               </w:rPr>
-              <w:t>20/0</w:t>
-            </w:r>
-            <w:r>
-              <w:rPr>
-                <w:sz w:val="22"/>
-                <w:lang w:val="pt-BR"/>
-              </w:rPr>
-              <w:t>9</w:t>
-            </w:r>
-            <w:r>
-              <w:rPr>
-                <w:sz w:val="22"/>
-                <w:lang w:val="pt-BR"/>
-              </w:rPr>
-              <w:t>/</w:t>
-            </w:r>
-            <w:r>
-              <w:rPr>
-                <w:sz w:val="22"/>
-                <w:lang w:val="pt-BR"/>
-              </w:rPr>
-              <w:t>23</w:t>
+              <w:t>20/09/23</w:t>
             </w:r>
           </w:p>
         </w:tc>
@@ -11622,28 +10807,7 @@
                 <w:sz w:val="22"/>
                 <w:lang w:val="pt-BR"/>
               </w:rPr>
-              <w:t>20/0</w:t>
-            </w:r>
-            <w:r>
-              <w:rPr>
-                <w:sz w:val="22"/>
-                <w:lang w:val="pt-BR"/>
-              </w:rPr>
-              <w:t>9</w:t>
-            </w:r>
-            <w:r>
-              <w:rPr>
-                <w:sz w:val="22"/>
-                <w:lang w:val="pt-BR"/>
-              </w:rPr>
-              <w:t>/</w:t>
-            </w:r>
-            <w:r>
-              <w:rPr>
-                <w:sz w:val="22"/>
-                <w:lang w:val="pt-BR"/>
-              </w:rPr>
-              <w:t>23</w:t>
+              <w:t>20/09/23</w:t>
             </w:r>
           </w:p>
         </w:tc>
@@ -11703,28 +10867,7 @@
                 <w:sz w:val="22"/>
                 <w:lang w:val="pt-BR"/>
               </w:rPr>
-              <w:t>20/</w:t>
-            </w:r>
-            <w:r>
-              <w:rPr>
-                <w:sz w:val="22"/>
-                <w:lang w:val="pt-BR"/>
-              </w:rPr>
-              <w:t>09</w:t>
-            </w:r>
-            <w:r>
-              <w:rPr>
-                <w:sz w:val="22"/>
-                <w:lang w:val="pt-BR"/>
-              </w:rPr>
-              <w:t>/</w:t>
-            </w:r>
-            <w:r>
-              <w:rPr>
-                <w:sz w:val="22"/>
-                <w:lang w:val="pt-BR"/>
-              </w:rPr>
-              <w:t>23</w:t>
+              <w:t>20/09/23</w:t>
             </w:r>
           </w:p>
         </w:tc>
@@ -11753,42 +10896,7 @@
                 <w:sz w:val="22"/>
                 <w:lang w:val="pt-BR"/>
               </w:rPr>
-              <w:t>2</w:t>
-            </w:r>
-            <w:r>
-              <w:rPr>
-                <w:sz w:val="22"/>
-                <w:lang w:val="pt-BR"/>
-              </w:rPr>
-              <w:t>0</w:t>
-            </w:r>
-            <w:r>
-              <w:rPr>
-                <w:sz w:val="22"/>
-                <w:lang w:val="pt-BR"/>
-              </w:rPr>
-              <w:t>/0</w:t>
-            </w:r>
-            <w:r>
-              <w:rPr>
-                <w:sz w:val="22"/>
-                <w:lang w:val="pt-BR"/>
-              </w:rPr>
-              <w:t>9</w:t>
-            </w:r>
-            <w:r>
-              <w:rPr>
-                <w:sz w:val="22"/>
-                <w:lang w:val="pt-BR"/>
-              </w:rPr>
-              <w:t>/</w:t>
-            </w:r>
-            <w:r>
-              <w:rPr>
-                <w:sz w:val="22"/>
-                <w:lang w:val="pt-BR"/>
-              </w:rPr>
-              <w:t>23</w:t>
+              <w:t>20/09/23</w:t>
             </w:r>
           </w:p>
         </w:tc>
@@ -11848,42 +10956,7 @@
                 <w:sz w:val="22"/>
                 <w:lang w:val="pt-BR"/>
               </w:rPr>
-              <w:t>2</w:t>
-            </w:r>
-            <w:r>
-              <w:rPr>
-                <w:sz w:val="22"/>
-                <w:lang w:val="pt-BR"/>
-              </w:rPr>
-              <w:t>1</w:t>
-            </w:r>
-            <w:r>
-              <w:rPr>
-                <w:sz w:val="22"/>
-                <w:lang w:val="pt-BR"/>
-              </w:rPr>
-              <w:t>/0</w:t>
-            </w:r>
-            <w:r>
-              <w:rPr>
-                <w:sz w:val="22"/>
-                <w:lang w:val="pt-BR"/>
-              </w:rPr>
-              <w:t>9</w:t>
-            </w:r>
-            <w:r>
-              <w:rPr>
-                <w:sz w:val="22"/>
-                <w:lang w:val="pt-BR"/>
-              </w:rPr>
-              <w:t>/</w:t>
-            </w:r>
-            <w:r>
-              <w:rPr>
-                <w:sz w:val="22"/>
-                <w:lang w:val="pt-BR"/>
-              </w:rPr>
-              <w:t>23</w:t>
+              <w:t>21/09/23</w:t>
             </w:r>
           </w:p>
         </w:tc>
@@ -11912,42 +10985,7 @@
                 <w:sz w:val="22"/>
                 <w:lang w:val="pt-BR"/>
               </w:rPr>
-              <w:t>2</w:t>
-            </w:r>
-            <w:r>
-              <w:rPr>
-                <w:sz w:val="22"/>
-                <w:lang w:val="pt-BR"/>
-              </w:rPr>
-              <w:t>4</w:t>
-            </w:r>
-            <w:r>
-              <w:rPr>
-                <w:sz w:val="22"/>
-                <w:lang w:val="pt-BR"/>
-              </w:rPr>
-              <w:t>/0</w:t>
-            </w:r>
-            <w:r>
-              <w:rPr>
-                <w:sz w:val="22"/>
-                <w:lang w:val="pt-BR"/>
-              </w:rPr>
-              <w:t>9</w:t>
-            </w:r>
-            <w:r>
-              <w:rPr>
-                <w:sz w:val="22"/>
-                <w:lang w:val="pt-BR"/>
-              </w:rPr>
-              <w:t>/</w:t>
-            </w:r>
-            <w:r>
-              <w:rPr>
-                <w:sz w:val="22"/>
-                <w:lang w:val="pt-BR"/>
-              </w:rPr>
-              <w:t>23</w:t>
+              <w:t>24/09/23</w:t>
             </w:r>
           </w:p>
         </w:tc>
@@ -12005,42 +11043,7 @@
                 <w:sz w:val="22"/>
                 <w:lang w:val="pt-BR"/>
               </w:rPr>
-              <w:t>2</w:t>
-            </w:r>
-            <w:r>
-              <w:rPr>
-                <w:sz w:val="22"/>
-                <w:lang w:val="pt-BR"/>
-              </w:rPr>
-              <w:t>5</w:t>
-            </w:r>
-            <w:r>
-              <w:rPr>
-                <w:sz w:val="22"/>
-                <w:lang w:val="pt-BR"/>
-              </w:rPr>
-              <w:t>/0</w:t>
-            </w:r>
-            <w:r>
-              <w:rPr>
-                <w:sz w:val="22"/>
-                <w:lang w:val="pt-BR"/>
-              </w:rPr>
-              <w:t>9</w:t>
-            </w:r>
-            <w:r>
-              <w:rPr>
-                <w:sz w:val="22"/>
-                <w:lang w:val="pt-BR"/>
-              </w:rPr>
-              <w:t>/</w:t>
-            </w:r>
-            <w:r>
-              <w:rPr>
-                <w:sz w:val="22"/>
-                <w:lang w:val="pt-BR"/>
-              </w:rPr>
-              <w:t>23</w:t>
+              <w:t>25/09/23</w:t>
             </w:r>
           </w:p>
         </w:tc>
@@ -12069,42 +11072,7 @@
                 <w:sz w:val="22"/>
                 <w:lang w:val="pt-BR"/>
               </w:rPr>
-              <w:t>2</w:t>
-            </w:r>
-            <w:r>
-              <w:rPr>
-                <w:sz w:val="22"/>
-                <w:lang w:val="pt-BR"/>
-              </w:rPr>
-              <w:t>6</w:t>
-            </w:r>
-            <w:r>
-              <w:rPr>
-                <w:sz w:val="22"/>
-                <w:lang w:val="pt-BR"/>
-              </w:rPr>
-              <w:t>/0</w:t>
-            </w:r>
-            <w:r>
-              <w:rPr>
-                <w:sz w:val="22"/>
-                <w:lang w:val="pt-BR"/>
-              </w:rPr>
-              <w:t>9</w:t>
-            </w:r>
-            <w:r>
-              <w:rPr>
-                <w:sz w:val="22"/>
-                <w:lang w:val="pt-BR"/>
-              </w:rPr>
-              <w:t>/</w:t>
-            </w:r>
-            <w:r>
-              <w:rPr>
-                <w:sz w:val="22"/>
-                <w:lang w:val="pt-BR"/>
-              </w:rPr>
-              <w:t>23</w:t>
+              <w:t>26/09/23</w:t>
             </w:r>
           </w:p>
         </w:tc>
@@ -12318,6 +11286,7 @@
         </w:tabs>
         <w:ind w:start="1080" w:hanging="360"/>
       </w:pPr>
+      <w:rPr/>
     </w:lvl>
     <w:lvl w:ilvl="2">
       <w:start w:val="1"/>
@@ -12330,6 +11299,7 @@
         </w:tabs>
         <w:ind w:start="1440" w:hanging="360"/>
       </w:pPr>
+      <w:rPr/>
     </w:lvl>
     <w:lvl w:ilvl="3">
       <w:start w:val="1"/>
@@ -12342,6 +11312,7 @@
         </w:tabs>
         <w:ind w:start="1800" w:hanging="360"/>
       </w:pPr>
+      <w:rPr/>
     </w:lvl>
     <w:lvl w:ilvl="4">
       <w:start w:val="1"/>
@@ -12354,6 +11325,7 @@
         </w:tabs>
         <w:ind w:start="2160" w:hanging="360"/>
       </w:pPr>
+      <w:rPr/>
     </w:lvl>
     <w:lvl w:ilvl="5">
       <w:start w:val="1"/>
@@ -12366,6 +11338,7 @@
         </w:tabs>
         <w:ind w:start="2520" w:hanging="360"/>
       </w:pPr>
+      <w:rPr/>
     </w:lvl>
     <w:lvl w:ilvl="6">
       <w:start w:val="1"/>
@@ -12378,6 +11351,7 @@
         </w:tabs>
         <w:ind w:start="2880" w:hanging="360"/>
       </w:pPr>
+      <w:rPr/>
     </w:lvl>
     <w:lvl w:ilvl="7">
       <w:start w:val="1"/>
@@ -12390,6 +11364,7 @@
         </w:tabs>
         <w:ind w:start="3240" w:hanging="360"/>
       </w:pPr>
+      <w:rPr/>
     </w:lvl>
     <w:lvl w:ilvl="8">
       <w:start w:val="1"/>
@@ -12402,6 +11377,7 @@
         </w:tabs>
         <w:ind w:start="3600" w:hanging="360"/>
       </w:pPr>
+      <w:rPr/>
     </w:lvl>
   </w:abstractNum>
   <w:abstractNum w:abstractNumId="3">
@@ -12431,6 +11407,7 @@
         </w:tabs>
         <w:ind w:start="1080" w:hanging="360"/>
       </w:pPr>
+      <w:rPr/>
     </w:lvl>
     <w:lvl w:ilvl="2">
       <w:start w:val="1"/>
@@ -12443,6 +11420,7 @@
         </w:tabs>
         <w:ind w:start="1440" w:hanging="360"/>
       </w:pPr>
+      <w:rPr/>
     </w:lvl>
     <w:lvl w:ilvl="3">
       <w:start w:val="1"/>
@@ -12455,6 +11433,7 @@
         </w:tabs>
         <w:ind w:start="1800" w:hanging="360"/>
       </w:pPr>
+      <w:rPr/>
     </w:lvl>
     <w:lvl w:ilvl="4">
       <w:start w:val="1"/>
@@ -12467,6 +11446,7 @@
         </w:tabs>
         <w:ind w:start="2160" w:hanging="360"/>
       </w:pPr>
+      <w:rPr/>
     </w:lvl>
     <w:lvl w:ilvl="5">
       <w:start w:val="1"/>
@@ -12479,6 +11459,7 @@
         </w:tabs>
         <w:ind w:start="2520" w:hanging="360"/>
       </w:pPr>
+      <w:rPr/>
     </w:lvl>
     <w:lvl w:ilvl="6">
       <w:start w:val="1"/>
@@ -12491,6 +11472,7 @@
         </w:tabs>
         <w:ind w:start="2880" w:hanging="360"/>
       </w:pPr>
+      <w:rPr/>
     </w:lvl>
     <w:lvl w:ilvl="7">
       <w:start w:val="1"/>
@@ -12503,6 +11485,7 @@
         </w:tabs>
         <w:ind w:start="3240" w:hanging="360"/>
       </w:pPr>
+      <w:rPr/>
     </w:lvl>
     <w:lvl w:ilvl="8">
       <w:start w:val="1"/>
@@ -12515,6 +11498,7 @@
         </w:tabs>
         <w:ind w:start="3600" w:hanging="360"/>
       </w:pPr>
+      <w:rPr/>
     </w:lvl>
   </w:abstractNum>
   <w:abstractNum w:abstractNumId="4">
@@ -12544,6 +11528,7 @@
         </w:tabs>
         <w:ind w:start="1080" w:hanging="360"/>
       </w:pPr>
+      <w:rPr/>
     </w:lvl>
     <w:lvl w:ilvl="2">
       <w:start w:val="1"/>
@@ -12556,6 +11541,7 @@
         </w:tabs>
         <w:ind w:start="1440" w:hanging="360"/>
       </w:pPr>
+      <w:rPr/>
     </w:lvl>
     <w:lvl w:ilvl="3">
       <w:start w:val="1"/>
@@ -12568,6 +11554,7 @@
         </w:tabs>
         <w:ind w:start="1800" w:hanging="360"/>
       </w:pPr>
+      <w:rPr/>
     </w:lvl>
     <w:lvl w:ilvl="4">
       <w:start w:val="1"/>
@@ -12580,6 +11567,7 @@
         </w:tabs>
         <w:ind w:start="2160" w:hanging="360"/>
       </w:pPr>
+      <w:rPr/>
     </w:lvl>
     <w:lvl w:ilvl="5">
       <w:start w:val="1"/>
@@ -12592,6 +11580,7 @@
         </w:tabs>
         <w:ind w:start="2520" w:hanging="360"/>
       </w:pPr>
+      <w:rPr/>
     </w:lvl>
     <w:lvl w:ilvl="6">
       <w:start w:val="1"/>
@@ -12604,6 +11593,7 @@
         </w:tabs>
         <w:ind w:start="2880" w:hanging="360"/>
       </w:pPr>
+      <w:rPr/>
     </w:lvl>
     <w:lvl w:ilvl="7">
       <w:start w:val="1"/>
@@ -12616,6 +11606,7 @@
         </w:tabs>
         <w:ind w:start="3240" w:hanging="360"/>
       </w:pPr>
+      <w:rPr/>
     </w:lvl>
     <w:lvl w:ilvl="8">
       <w:start w:val="1"/>
@@ -12628,6 +11619,7 @@
         </w:tabs>
         <w:ind w:start="3600" w:hanging="360"/>
       </w:pPr>
+      <w:rPr/>
     </w:lvl>
   </w:abstractNum>
   <w:abstractNum w:abstractNumId="5">
@@ -12657,6 +11649,7 @@
         </w:tabs>
         <w:ind w:start="1080" w:hanging="360"/>
       </w:pPr>
+      <w:rPr/>
     </w:lvl>
     <w:lvl w:ilvl="2">
       <w:start w:val="1"/>
@@ -12669,6 +11662,7 @@
         </w:tabs>
         <w:ind w:start="1440" w:hanging="360"/>
       </w:pPr>
+      <w:rPr/>
     </w:lvl>
     <w:lvl w:ilvl="3">
       <w:start w:val="1"/>
@@ -12681,6 +11675,7 @@
         </w:tabs>
         <w:ind w:start="1800" w:hanging="360"/>
       </w:pPr>
+      <w:rPr/>
     </w:lvl>
     <w:lvl w:ilvl="4">
       <w:start w:val="1"/>
@@ -12693,6 +11688,7 @@
         </w:tabs>
         <w:ind w:start="2160" w:hanging="360"/>
       </w:pPr>
+      <w:rPr/>
     </w:lvl>
     <w:lvl w:ilvl="5">
       <w:start w:val="1"/>
@@ -12705,6 +11701,7 @@
         </w:tabs>
         <w:ind w:start="2520" w:hanging="360"/>
       </w:pPr>
+      <w:rPr/>
     </w:lvl>
     <w:lvl w:ilvl="6">
       <w:start w:val="1"/>
@@ -12717,6 +11714,7 @@
         </w:tabs>
         <w:ind w:start="2880" w:hanging="360"/>
       </w:pPr>
+      <w:rPr/>
     </w:lvl>
     <w:lvl w:ilvl="7">
       <w:start w:val="1"/>
@@ -12729,6 +11727,7 @@
         </w:tabs>
         <w:ind w:start="3240" w:hanging="360"/>
       </w:pPr>
+      <w:rPr/>
     </w:lvl>
     <w:lvl w:ilvl="8">
       <w:start w:val="1"/>
@@ -12741,6 +11740,7 @@
         </w:tabs>
         <w:ind w:start="3600" w:hanging="360"/>
       </w:pPr>
+      <w:rPr/>
     </w:lvl>
   </w:abstractNum>
   <w:abstractNum w:abstractNumId="6">
@@ -12770,6 +11770,7 @@
         </w:tabs>
         <w:ind w:start="1080" w:hanging="360"/>
       </w:pPr>
+      <w:rPr/>
     </w:lvl>
     <w:lvl w:ilvl="2">
       <w:start w:val="1"/>
@@ -12782,6 +11783,7 @@
         </w:tabs>
         <w:ind w:start="1440" w:hanging="360"/>
       </w:pPr>
+      <w:rPr/>
     </w:lvl>
     <w:lvl w:ilvl="3">
       <w:start w:val="1"/>
@@ -12794,6 +11796,7 @@
         </w:tabs>
         <w:ind w:start="1800" w:hanging="360"/>
       </w:pPr>
+      <w:rPr/>
     </w:lvl>
     <w:lvl w:ilvl="4">
       <w:start w:val="1"/>
@@ -12806,6 +11809,7 @@
         </w:tabs>
         <w:ind w:start="2160" w:hanging="360"/>
       </w:pPr>
+      <w:rPr/>
     </w:lvl>
     <w:lvl w:ilvl="5">
       <w:start w:val="1"/>
@@ -12818,6 +11822,7 @@
         </w:tabs>
         <w:ind w:start="2520" w:hanging="360"/>
       </w:pPr>
+      <w:rPr/>
     </w:lvl>
     <w:lvl w:ilvl="6">
       <w:start w:val="1"/>
@@ -12830,6 +11835,7 @@
         </w:tabs>
         <w:ind w:start="2880" w:hanging="360"/>
       </w:pPr>
+      <w:rPr/>
     </w:lvl>
     <w:lvl w:ilvl="7">
       <w:start w:val="1"/>
@@ -12842,6 +11848,7 @@
         </w:tabs>
         <w:ind w:start="3240" w:hanging="360"/>
       </w:pPr>
+      <w:rPr/>
     </w:lvl>
     <w:lvl w:ilvl="8">
       <w:start w:val="1"/>
@@ -12854,6 +11861,7 @@
         </w:tabs>
         <w:ind w:start="3600" w:hanging="360"/>
       </w:pPr>
+      <w:rPr/>
     </w:lvl>
   </w:abstractNum>
   <w:abstractNum w:abstractNumId="7">
@@ -12883,6 +11891,7 @@
         </w:tabs>
         <w:ind w:start="1080" w:hanging="360"/>
       </w:pPr>
+      <w:rPr/>
     </w:lvl>
     <w:lvl w:ilvl="2">
       <w:start w:val="1"/>
@@ -12895,6 +11904,7 @@
         </w:tabs>
         <w:ind w:start="1440" w:hanging="360"/>
       </w:pPr>
+      <w:rPr/>
     </w:lvl>
     <w:lvl w:ilvl="3">
       <w:start w:val="1"/>
@@ -12907,6 +11917,7 @@
         </w:tabs>
         <w:ind w:start="1800" w:hanging="360"/>
       </w:pPr>
+      <w:rPr/>
     </w:lvl>
     <w:lvl w:ilvl="4">
       <w:start w:val="1"/>
@@ -12919,6 +11930,7 @@
         </w:tabs>
         <w:ind w:start="2160" w:hanging="360"/>
       </w:pPr>
+      <w:rPr/>
     </w:lvl>
     <w:lvl w:ilvl="5">
       <w:start w:val="1"/>
@@ -12931,6 +11943,7 @@
         </w:tabs>
         <w:ind w:start="2520" w:hanging="360"/>
       </w:pPr>
+      <w:rPr/>
     </w:lvl>
     <w:lvl w:ilvl="6">
       <w:start w:val="1"/>
@@ -12943,6 +11956,7 @@
         </w:tabs>
         <w:ind w:start="2880" w:hanging="360"/>
       </w:pPr>
+      <w:rPr/>
     </w:lvl>
     <w:lvl w:ilvl="7">
       <w:start w:val="1"/>
@@ -12955,6 +11969,7 @@
         </w:tabs>
         <w:ind w:start="3240" w:hanging="360"/>
       </w:pPr>
+      <w:rPr/>
     </w:lvl>
     <w:lvl w:ilvl="8">
       <w:start w:val="1"/>
@@ -12967,6 +11982,7 @@
         </w:tabs>
         <w:ind w:start="3600" w:hanging="360"/>
       </w:pPr>
+      <w:rPr/>
     </w:lvl>
   </w:abstractNum>
   <w:abstractNum w:abstractNumId="8">
@@ -12996,6 +12012,7 @@
         </w:tabs>
         <w:ind w:start="1080" w:hanging="360"/>
       </w:pPr>
+      <w:rPr/>
     </w:lvl>
     <w:lvl w:ilvl="2">
       <w:start w:val="1"/>
@@ -13008,6 +12025,7 @@
         </w:tabs>
         <w:ind w:start="1440" w:hanging="360"/>
       </w:pPr>
+      <w:rPr/>
     </w:lvl>
     <w:lvl w:ilvl="3">
       <w:start w:val="1"/>
@@ -13020,6 +12038,7 @@
         </w:tabs>
         <w:ind w:start="1800" w:hanging="360"/>
       </w:pPr>
+      <w:rPr/>
     </w:lvl>
     <w:lvl w:ilvl="4">
       <w:start w:val="1"/>
@@ -13032,6 +12051,7 @@
         </w:tabs>
         <w:ind w:start="2160" w:hanging="360"/>
       </w:pPr>
+      <w:rPr/>
     </w:lvl>
     <w:lvl w:ilvl="5">
       <w:start w:val="1"/>
@@ -13044,6 +12064,7 @@
         </w:tabs>
         <w:ind w:start="2520" w:hanging="360"/>
       </w:pPr>
+      <w:rPr/>
     </w:lvl>
     <w:lvl w:ilvl="6">
       <w:start w:val="1"/>
@@ -13056,6 +12077,7 @@
         </w:tabs>
         <w:ind w:start="2880" w:hanging="360"/>
       </w:pPr>
+      <w:rPr/>
     </w:lvl>
     <w:lvl w:ilvl="7">
       <w:start w:val="1"/>
@@ -13068,6 +12090,7 @@
         </w:tabs>
         <w:ind w:start="3240" w:hanging="360"/>
       </w:pPr>
+      <w:rPr/>
     </w:lvl>
     <w:lvl w:ilvl="8">
       <w:start w:val="1"/>
@@ -13080,6 +12103,7 @@
         </w:tabs>
         <w:ind w:start="3600" w:hanging="360"/>
       </w:pPr>
+      <w:rPr/>
     </w:lvl>
   </w:abstractNum>
   <w:abstractNum w:abstractNumId="9">
@@ -13109,6 +12133,7 @@
         </w:tabs>
         <w:ind w:start="1080" w:hanging="360"/>
       </w:pPr>
+      <w:rPr/>
     </w:lvl>
     <w:lvl w:ilvl="2">
       <w:start w:val="1"/>
@@ -13121,6 +12146,7 @@
         </w:tabs>
         <w:ind w:start="1440" w:hanging="360"/>
       </w:pPr>
+      <w:rPr/>
     </w:lvl>
     <w:lvl w:ilvl="3">
       <w:start w:val="1"/>
@@ -13133,6 +12159,7 @@
         </w:tabs>
         <w:ind w:start="1800" w:hanging="360"/>
       </w:pPr>
+      <w:rPr/>
     </w:lvl>
     <w:lvl w:ilvl="4">
       <w:start w:val="1"/>
@@ -13145,6 +12172,7 @@
         </w:tabs>
         <w:ind w:start="2160" w:hanging="360"/>
       </w:pPr>
+      <w:rPr/>
     </w:lvl>
     <w:lvl w:ilvl="5">
       <w:start w:val="1"/>
@@ -13157,6 +12185,7 @@
         </w:tabs>
         <w:ind w:start="2520" w:hanging="360"/>
       </w:pPr>
+      <w:rPr/>
     </w:lvl>
     <w:lvl w:ilvl="6">
       <w:start w:val="1"/>
@@ -13169,6 +12198,7 @@
         </w:tabs>
         <w:ind w:start="2880" w:hanging="360"/>
       </w:pPr>
+      <w:rPr/>
     </w:lvl>
     <w:lvl w:ilvl="7">
       <w:start w:val="1"/>
@@ -13181,6 +12211,7 @@
         </w:tabs>
         <w:ind w:start="3240" w:hanging="360"/>
       </w:pPr>
+      <w:rPr/>
     </w:lvl>
     <w:lvl w:ilvl="8">
       <w:start w:val="1"/>
@@ -13193,6 +12224,7 @@
         </w:tabs>
         <w:ind w:start="3600" w:hanging="360"/>
       </w:pPr>
+      <w:rPr/>
     </w:lvl>
   </w:abstractNum>
   <w:abstractNum w:abstractNumId="10">
@@ -13222,6 +12254,7 @@
         </w:tabs>
         <w:ind w:start="1080" w:hanging="360"/>
       </w:pPr>
+      <w:rPr/>
     </w:lvl>
     <w:lvl w:ilvl="2">
       <w:start w:val="1"/>
@@ -13234,6 +12267,7 @@
         </w:tabs>
         <w:ind w:start="1440" w:hanging="360"/>
       </w:pPr>
+      <w:rPr/>
     </w:lvl>
     <w:lvl w:ilvl="3">
       <w:start w:val="1"/>
@@ -13246,6 +12280,7 @@
         </w:tabs>
         <w:ind w:start="1800" w:hanging="360"/>
       </w:pPr>
+      <w:rPr/>
     </w:lvl>
     <w:lvl w:ilvl="4">
       <w:start w:val="1"/>
@@ -13258,6 +12293,7 @@
         </w:tabs>
         <w:ind w:start="2160" w:hanging="360"/>
       </w:pPr>
+      <w:rPr/>
     </w:lvl>
     <w:lvl w:ilvl="5">
       <w:start w:val="1"/>
@@ -13270,6 +12306,7 @@
         </w:tabs>
         <w:ind w:start="2520" w:hanging="360"/>
       </w:pPr>
+      <w:rPr/>
     </w:lvl>
     <w:lvl w:ilvl="6">
       <w:start w:val="1"/>
@@ -13282,6 +12319,7 @@
         </w:tabs>
         <w:ind w:start="2880" w:hanging="360"/>
       </w:pPr>
+      <w:rPr/>
     </w:lvl>
     <w:lvl w:ilvl="7">
       <w:start w:val="1"/>
@@ -13294,6 +12332,7 @@
         </w:tabs>
         <w:ind w:start="3240" w:hanging="360"/>
       </w:pPr>
+      <w:rPr/>
     </w:lvl>
     <w:lvl w:ilvl="8">
       <w:start w:val="1"/>
@@ -13306,6 +12345,7 @@
         </w:tabs>
         <w:ind w:start="3600" w:hanging="360"/>
       </w:pPr>
+      <w:rPr/>
     </w:lvl>
   </w:abstractNum>
   <w:abstractNum w:abstractNumId="11">
@@ -13335,6 +12375,7 @@
         </w:tabs>
         <w:ind w:start="1080" w:hanging="360"/>
       </w:pPr>
+      <w:rPr/>
     </w:lvl>
     <w:lvl w:ilvl="2">
       <w:start w:val="1"/>
@@ -13347,6 +12388,7 @@
         </w:tabs>
         <w:ind w:start="1440" w:hanging="360"/>
       </w:pPr>
+      <w:rPr/>
     </w:lvl>
     <w:lvl w:ilvl="3">
       <w:start w:val="1"/>
@@ -13359,6 +12401,7 @@
         </w:tabs>
         <w:ind w:start="1800" w:hanging="360"/>
       </w:pPr>
+      <w:rPr/>
     </w:lvl>
     <w:lvl w:ilvl="4">
       <w:start w:val="1"/>
@@ -13371,6 +12414,7 @@
         </w:tabs>
         <w:ind w:start="2160" w:hanging="360"/>
       </w:pPr>
+      <w:rPr/>
     </w:lvl>
     <w:lvl w:ilvl="5">
       <w:start w:val="1"/>
@@ -13383,6 +12427,7 @@
         </w:tabs>
         <w:ind w:start="2520" w:hanging="360"/>
       </w:pPr>
+      <w:rPr/>
     </w:lvl>
     <w:lvl w:ilvl="6">
       <w:start w:val="1"/>
@@ -13395,6 +12440,7 @@
         </w:tabs>
         <w:ind w:start="2880" w:hanging="360"/>
       </w:pPr>
+      <w:rPr/>
     </w:lvl>
     <w:lvl w:ilvl="7">
       <w:start w:val="1"/>
@@ -13407,6 +12453,7 @@
         </w:tabs>
         <w:ind w:start="3240" w:hanging="360"/>
       </w:pPr>
+      <w:rPr/>
     </w:lvl>
     <w:lvl w:ilvl="8">
       <w:start w:val="1"/>
@@ -13419,6 +12466,7 @@
         </w:tabs>
         <w:ind w:start="3600" w:hanging="360"/>
       </w:pPr>
+      <w:rPr/>
     </w:lvl>
   </w:abstractNum>
   <w:abstractNum w:abstractNumId="12">
@@ -13448,6 +12496,7 @@
         </w:tabs>
         <w:ind w:start="1080" w:hanging="360"/>
       </w:pPr>
+      <w:rPr/>
     </w:lvl>
     <w:lvl w:ilvl="2">
       <w:start w:val="1"/>
@@ -13460,6 +12509,7 @@
         </w:tabs>
         <w:ind w:start="1440" w:hanging="360"/>
       </w:pPr>
+      <w:rPr/>
     </w:lvl>
     <w:lvl w:ilvl="3">
       <w:start w:val="1"/>
@@ -13472,6 +12522,7 @@
         </w:tabs>
         <w:ind w:start="1800" w:hanging="360"/>
       </w:pPr>
+      <w:rPr/>
     </w:lvl>
     <w:lvl w:ilvl="4">
       <w:start w:val="1"/>
@@ -13484,6 +12535,7 @@
         </w:tabs>
         <w:ind w:start="2160" w:hanging="360"/>
       </w:pPr>
+      <w:rPr/>
     </w:lvl>
     <w:lvl w:ilvl="5">
       <w:start w:val="1"/>
@@ -13496,6 +12548,7 @@
         </w:tabs>
         <w:ind w:start="2520" w:hanging="360"/>
       </w:pPr>
+      <w:rPr/>
     </w:lvl>
     <w:lvl w:ilvl="6">
       <w:start w:val="1"/>
@@ -13508,6 +12561,7 @@
         </w:tabs>
         <w:ind w:start="2880" w:hanging="360"/>
       </w:pPr>
+      <w:rPr/>
     </w:lvl>
     <w:lvl w:ilvl="7">
       <w:start w:val="1"/>
@@ -13520,6 +12574,7 @@
         </w:tabs>
         <w:ind w:start="3240" w:hanging="360"/>
       </w:pPr>
+      <w:rPr/>
     </w:lvl>
     <w:lvl w:ilvl="8">
       <w:start w:val="1"/>
@@ -13532,6 +12587,7 @@
         </w:tabs>
         <w:ind w:start="3600" w:hanging="360"/>
       </w:pPr>
+      <w:rPr/>
     </w:lvl>
   </w:abstractNum>
   <w:abstractNum w:abstractNumId="13">
@@ -13561,6 +12617,7 @@
         </w:tabs>
         <w:ind w:start="1080" w:hanging="360"/>
       </w:pPr>
+      <w:rPr/>
     </w:lvl>
     <w:lvl w:ilvl="2">
       <w:start w:val="1"/>
@@ -13573,6 +12630,7 @@
         </w:tabs>
         <w:ind w:start="1440" w:hanging="360"/>
       </w:pPr>
+      <w:rPr/>
     </w:lvl>
     <w:lvl w:ilvl="3">
       <w:start w:val="1"/>
@@ -13585,6 +12643,7 @@
         </w:tabs>
         <w:ind w:start="1800" w:hanging="360"/>
       </w:pPr>
+      <w:rPr/>
     </w:lvl>
     <w:lvl w:ilvl="4">
       <w:start w:val="1"/>
@@ -13597,6 +12656,7 @@
         </w:tabs>
         <w:ind w:start="2160" w:hanging="360"/>
       </w:pPr>
+      <w:rPr/>
     </w:lvl>
     <w:lvl w:ilvl="5">
       <w:start w:val="1"/>
@@ -13609,6 +12669,7 @@
         </w:tabs>
         <w:ind w:start="2520" w:hanging="360"/>
       </w:pPr>
+      <w:rPr/>
     </w:lvl>
     <w:lvl w:ilvl="6">
       <w:start w:val="1"/>
@@ -13621,6 +12682,7 @@
         </w:tabs>
         <w:ind w:start="2880" w:hanging="360"/>
       </w:pPr>
+      <w:rPr/>
     </w:lvl>
     <w:lvl w:ilvl="7">
       <w:start w:val="1"/>
@@ -13633,6 +12695,7 @@
         </w:tabs>
         <w:ind w:start="3240" w:hanging="360"/>
       </w:pPr>
+      <w:rPr/>
     </w:lvl>
     <w:lvl w:ilvl="8">
       <w:start w:val="1"/>
@@ -13645,6 +12708,7 @@
         </w:tabs>
         <w:ind w:start="3600" w:hanging="360"/>
       </w:pPr>
+      <w:rPr/>
     </w:lvl>
   </w:abstractNum>
   <w:abstractNum w:abstractNumId="14">
@@ -13674,6 +12738,7 @@
         </w:tabs>
         <w:ind w:start="1080" w:hanging="360"/>
       </w:pPr>
+      <w:rPr/>
     </w:lvl>
     <w:lvl w:ilvl="2">
       <w:start w:val="1"/>
@@ -13686,6 +12751,7 @@
         </w:tabs>
         <w:ind w:start="1440" w:hanging="360"/>
       </w:pPr>
+      <w:rPr/>
     </w:lvl>
     <w:lvl w:ilvl="3">
       <w:start w:val="1"/>
@@ -13698,6 +12764,7 @@
         </w:tabs>
         <w:ind w:start="1800" w:hanging="360"/>
       </w:pPr>
+      <w:rPr/>
     </w:lvl>
     <w:lvl w:ilvl="4">
       <w:start w:val="1"/>
@@ -13710,6 +12777,7 @@
         </w:tabs>
         <w:ind w:start="2160" w:hanging="360"/>
       </w:pPr>
+      <w:rPr/>
     </w:lvl>
     <w:lvl w:ilvl="5">
       <w:start w:val="1"/>
@@ -13722,6 +12790,7 @@
         </w:tabs>
         <w:ind w:start="2520" w:hanging="360"/>
       </w:pPr>
+      <w:rPr/>
     </w:lvl>
     <w:lvl w:ilvl="6">
       <w:start w:val="1"/>
@@ -13734,6 +12803,7 @@
         </w:tabs>
         <w:ind w:start="2880" w:hanging="360"/>
       </w:pPr>
+      <w:rPr/>
     </w:lvl>
     <w:lvl w:ilvl="7">
       <w:start w:val="1"/>
@@ -13746,6 +12816,7 @@
         </w:tabs>
         <w:ind w:start="3240" w:hanging="360"/>
       </w:pPr>
+      <w:rPr/>
     </w:lvl>
     <w:lvl w:ilvl="8">
       <w:start w:val="1"/>
@@ -13758,6 +12829,7 @@
         </w:tabs>
         <w:ind w:start="3600" w:hanging="360"/>
       </w:pPr>
+      <w:rPr/>
     </w:lvl>
   </w:abstractNum>
   <w:abstractNum w:abstractNumId="15">
@@ -13787,6 +12859,7 @@
         </w:tabs>
         <w:ind w:start="1080" w:hanging="360"/>
       </w:pPr>
+      <w:rPr/>
     </w:lvl>
     <w:lvl w:ilvl="2">
       <w:start w:val="1"/>
@@ -13799,6 +12872,7 @@
         </w:tabs>
         <w:ind w:start="1440" w:hanging="360"/>
       </w:pPr>
+      <w:rPr/>
     </w:lvl>
     <w:lvl w:ilvl="3">
       <w:start w:val="1"/>
@@ -13811,6 +12885,7 @@
         </w:tabs>
         <w:ind w:start="1800" w:hanging="360"/>
       </w:pPr>
+      <w:rPr/>
     </w:lvl>
     <w:lvl w:ilvl="4">
       <w:start w:val="1"/>
@@ -13823,6 +12898,7 @@
         </w:tabs>
         <w:ind w:start="2160" w:hanging="360"/>
       </w:pPr>
+      <w:rPr/>
     </w:lvl>
     <w:lvl w:ilvl="5">
       <w:start w:val="1"/>
@@ -13835,6 +12911,7 @@
         </w:tabs>
         <w:ind w:start="2520" w:hanging="360"/>
       </w:pPr>
+      <w:rPr/>
     </w:lvl>
     <w:lvl w:ilvl="6">
       <w:start w:val="1"/>
@@ -13847,6 +12924,7 @@
         </w:tabs>
         <w:ind w:start="2880" w:hanging="360"/>
       </w:pPr>
+      <w:rPr/>
     </w:lvl>
     <w:lvl w:ilvl="7">
       <w:start w:val="1"/>
@@ -13859,6 +12937,7 @@
         </w:tabs>
         <w:ind w:start="3240" w:hanging="360"/>
       </w:pPr>
+      <w:rPr/>
     </w:lvl>
     <w:lvl w:ilvl="8">
       <w:start w:val="1"/>
@@ -13871,6 +12950,7 @@
         </w:tabs>
         <w:ind w:start="3600" w:hanging="360"/>
       </w:pPr>
+      <w:rPr/>
     </w:lvl>
   </w:abstractNum>
   <w:abstractNum w:abstractNumId="16">
@@ -13900,6 +12980,7 @@
         </w:tabs>
         <w:ind w:start="1080" w:hanging="360"/>
       </w:pPr>
+      <w:rPr/>
     </w:lvl>
     <w:lvl w:ilvl="2">
       <w:start w:val="1"/>
@@ -13912,6 +12993,7 @@
         </w:tabs>
         <w:ind w:start="1440" w:hanging="360"/>
       </w:pPr>
+      <w:rPr/>
     </w:lvl>
     <w:lvl w:ilvl="3">
       <w:start w:val="1"/>
@@ -13924,6 +13006,7 @@
         </w:tabs>
         <w:ind w:start="1800" w:hanging="360"/>
       </w:pPr>
+      <w:rPr/>
     </w:lvl>
     <w:lvl w:ilvl="4">
       <w:start w:val="1"/>
@@ -13936,6 +13019,7 @@
         </w:tabs>
         <w:ind w:start="2160" w:hanging="360"/>
       </w:pPr>
+      <w:rPr/>
     </w:lvl>
     <w:lvl w:ilvl="5">
       <w:start w:val="1"/>
@@ -13948,6 +13032,7 @@
         </w:tabs>
         <w:ind w:start="2520" w:hanging="360"/>
       </w:pPr>
+      <w:rPr/>
     </w:lvl>
     <w:lvl w:ilvl="6">
       <w:start w:val="1"/>
@@ -13960,6 +13045,7 @@
         </w:tabs>
         <w:ind w:start="2880" w:hanging="360"/>
       </w:pPr>
+      <w:rPr/>
     </w:lvl>
     <w:lvl w:ilvl="7">
       <w:start w:val="1"/>
@@ -13972,6 +13058,7 @@
         </w:tabs>
         <w:ind w:start="3240" w:hanging="360"/>
       </w:pPr>
+      <w:rPr/>
     </w:lvl>
     <w:lvl w:ilvl="8">
       <w:start w:val="1"/>
@@ -13984,6 +13071,7 @@
         </w:tabs>
         <w:ind w:start="3600" w:hanging="360"/>
       </w:pPr>
+      <w:rPr/>
     </w:lvl>
   </w:abstractNum>
   <w:abstractNum w:abstractNumId="17">
@@ -14013,6 +13101,7 @@
         </w:tabs>
         <w:ind w:start="1080" w:hanging="360"/>
       </w:pPr>
+      <w:rPr/>
     </w:lvl>
     <w:lvl w:ilvl="2">
       <w:start w:val="1"/>
@@ -14025,6 +13114,7 @@
         </w:tabs>
         <w:ind w:start="1440" w:hanging="360"/>
       </w:pPr>
+      <w:rPr/>
     </w:lvl>
     <w:lvl w:ilvl="3">
       <w:start w:val="1"/>
@@ -14037,6 +13127,7 @@
         </w:tabs>
         <w:ind w:start="1800" w:hanging="360"/>
       </w:pPr>
+      <w:rPr/>
     </w:lvl>
     <w:lvl w:ilvl="4">
       <w:start w:val="1"/>
@@ -14049,6 +13140,7 @@
         </w:tabs>
         <w:ind w:start="2160" w:hanging="360"/>
       </w:pPr>
+      <w:rPr/>
     </w:lvl>
     <w:lvl w:ilvl="5">
       <w:start w:val="1"/>
@@ -14061,6 +13153,7 @@
         </w:tabs>
         <w:ind w:start="2520" w:hanging="360"/>
       </w:pPr>
+      <w:rPr/>
     </w:lvl>
     <w:lvl w:ilvl="6">
       <w:start w:val="1"/>
@@ -14073,6 +13166,7 @@
         </w:tabs>
         <w:ind w:start="2880" w:hanging="360"/>
       </w:pPr>
+      <w:rPr/>
     </w:lvl>
     <w:lvl w:ilvl="7">
       <w:start w:val="1"/>
@@ -14085,6 +13179,7 @@
         </w:tabs>
         <w:ind w:start="3240" w:hanging="360"/>
       </w:pPr>
+      <w:rPr/>
     </w:lvl>
     <w:lvl w:ilvl="8">
       <w:start w:val="1"/>
@@ -14097,6 +13192,7 @@
         </w:tabs>
         <w:ind w:start="3600" w:hanging="360"/>
       </w:pPr>
+      <w:rPr/>
     </w:lvl>
   </w:abstractNum>
   <w:abstractNum w:abstractNumId="18">
@@ -14126,6 +13222,7 @@
         </w:tabs>
         <w:ind w:start="1080" w:hanging="360"/>
       </w:pPr>
+      <w:rPr/>
     </w:lvl>
     <w:lvl w:ilvl="2">
       <w:start w:val="1"/>
@@ -14138,6 +13235,7 @@
         </w:tabs>
         <w:ind w:start="1440" w:hanging="360"/>
       </w:pPr>
+      <w:rPr/>
     </w:lvl>
     <w:lvl w:ilvl="3">
       <w:start w:val="1"/>
@@ -14150,6 +13248,7 @@
         </w:tabs>
         <w:ind w:start="1800" w:hanging="360"/>
       </w:pPr>
+      <w:rPr/>
     </w:lvl>
     <w:lvl w:ilvl="4">
       <w:start w:val="1"/>
@@ -14162,6 +13261,7 @@
         </w:tabs>
         <w:ind w:start="2160" w:hanging="360"/>
       </w:pPr>
+      <w:rPr/>
     </w:lvl>
     <w:lvl w:ilvl="5">
       <w:start w:val="1"/>
@@ -14174,6 +13274,7 @@
         </w:tabs>
         <w:ind w:start="2520" w:hanging="360"/>
       </w:pPr>
+      <w:rPr/>
     </w:lvl>
     <w:lvl w:ilvl="6">
       <w:start w:val="1"/>
@@ -14186,6 +13287,7 @@
         </w:tabs>
         <w:ind w:start="2880" w:hanging="360"/>
       </w:pPr>
+      <w:rPr/>
     </w:lvl>
     <w:lvl w:ilvl="7">
       <w:start w:val="1"/>
@@ -14198,6 +13300,7 @@
         </w:tabs>
         <w:ind w:start="3240" w:hanging="360"/>
       </w:pPr>
+      <w:rPr/>
     </w:lvl>
     <w:lvl w:ilvl="8">
       <w:start w:val="1"/>
@@ -14210,6 +13313,7 @@
         </w:tabs>
         <w:ind w:start="3600" w:hanging="360"/>
       </w:pPr>
+      <w:rPr/>
     </w:lvl>
   </w:abstractNum>
   <w:abstractNum w:abstractNumId="19">
@@ -14239,6 +13343,7 @@
         </w:tabs>
         <w:ind w:start="1080" w:hanging="360"/>
       </w:pPr>
+      <w:rPr/>
     </w:lvl>
     <w:lvl w:ilvl="2">
       <w:start w:val="1"/>
@@ -14251,6 +13356,7 @@
         </w:tabs>
         <w:ind w:start="1440" w:hanging="360"/>
       </w:pPr>
+      <w:rPr/>
     </w:lvl>
     <w:lvl w:ilvl="3">
       <w:start w:val="1"/>
@@ -14263,6 +13369,7 @@
         </w:tabs>
         <w:ind w:start="1800" w:hanging="360"/>
       </w:pPr>
+      <w:rPr/>
     </w:lvl>
     <w:lvl w:ilvl="4">
       <w:start w:val="1"/>
@@ -14275,6 +13382,7 @@
         </w:tabs>
         <w:ind w:start="2160" w:hanging="360"/>
       </w:pPr>
+      <w:rPr/>
     </w:lvl>
     <w:lvl w:ilvl="5">
       <w:start w:val="1"/>
@@ -14287,6 +13395,7 @@
         </w:tabs>
         <w:ind w:start="2520" w:hanging="360"/>
       </w:pPr>
+      <w:rPr/>
     </w:lvl>
     <w:lvl w:ilvl="6">
       <w:start w:val="1"/>
@@ -14299,6 +13408,7 @@
         </w:tabs>
         <w:ind w:start="2880" w:hanging="360"/>
       </w:pPr>
+      <w:rPr/>
     </w:lvl>
     <w:lvl w:ilvl="7">
       <w:start w:val="1"/>
@@ -14311,6 +13421,7 @@
         </w:tabs>
         <w:ind w:start="3240" w:hanging="360"/>
       </w:pPr>
+      <w:rPr/>
     </w:lvl>
     <w:lvl w:ilvl="8">
       <w:start w:val="1"/>
@@ -14323,6 +13434,7 @@
         </w:tabs>
         <w:ind w:start="3600" w:hanging="360"/>
       </w:pPr>
+      <w:rPr/>
     </w:lvl>
   </w:abstractNum>
   <w:abstractNum w:abstractNumId="20">
@@ -14352,6 +13464,7 @@
         </w:tabs>
         <w:ind w:start="1080" w:hanging="360"/>
       </w:pPr>
+      <w:rPr/>
     </w:lvl>
     <w:lvl w:ilvl="2">
       <w:start w:val="1"/>
@@ -14364,6 +13477,7 @@
         </w:tabs>
         <w:ind w:start="1440" w:hanging="360"/>
       </w:pPr>
+      <w:rPr/>
     </w:lvl>
     <w:lvl w:ilvl="3">
       <w:start w:val="1"/>
@@ -14376,6 +13490,7 @@
         </w:tabs>
         <w:ind w:start="1800" w:hanging="360"/>
       </w:pPr>
+      <w:rPr/>
     </w:lvl>
     <w:lvl w:ilvl="4">
       <w:start w:val="1"/>
@@ -14388,6 +13503,7 @@
         </w:tabs>
         <w:ind w:start="2160" w:hanging="360"/>
       </w:pPr>
+      <w:rPr/>
     </w:lvl>
     <w:lvl w:ilvl="5">
       <w:start w:val="1"/>
@@ -14400,6 +13516,7 @@
         </w:tabs>
         <w:ind w:start="2520" w:hanging="360"/>
       </w:pPr>
+      <w:rPr/>
     </w:lvl>
     <w:lvl w:ilvl="6">
       <w:start w:val="1"/>
@@ -14412,6 +13529,7 @@
         </w:tabs>
         <w:ind w:start="2880" w:hanging="360"/>
       </w:pPr>
+      <w:rPr/>
     </w:lvl>
     <w:lvl w:ilvl="7">
       <w:start w:val="1"/>
@@ -14424,6 +13542,7 @@
         </w:tabs>
         <w:ind w:start="3240" w:hanging="360"/>
       </w:pPr>
+      <w:rPr/>
     </w:lvl>
     <w:lvl w:ilvl="8">
       <w:start w:val="1"/>
@@ -14436,6 +13555,7 @@
         </w:tabs>
         <w:ind w:start="3600" w:hanging="360"/>
       </w:pPr>
+      <w:rPr/>
     </w:lvl>
   </w:abstractNum>
   <w:abstractNum w:abstractNumId="21">
@@ -14465,6 +13585,7 @@
         </w:tabs>
         <w:ind w:start="1080" w:hanging="360"/>
       </w:pPr>
+      <w:rPr/>
     </w:lvl>
     <w:lvl w:ilvl="2">
       <w:start w:val="1"/>
@@ -14477,6 +13598,7 @@
         </w:tabs>
         <w:ind w:start="1440" w:hanging="360"/>
       </w:pPr>
+      <w:rPr/>
     </w:lvl>
     <w:lvl w:ilvl="3">
       <w:start w:val="1"/>
@@ -14489,6 +13611,7 @@
         </w:tabs>
         <w:ind w:start="1800" w:hanging="360"/>
       </w:pPr>
+      <w:rPr/>
     </w:lvl>
     <w:lvl w:ilvl="4">
       <w:start w:val="1"/>
@@ -14501,6 +13624,7 @@
         </w:tabs>
         <w:ind w:start="2160" w:hanging="360"/>
       </w:pPr>
+      <w:rPr/>
     </w:lvl>
     <w:lvl w:ilvl="5">
       <w:start w:val="1"/>
@@ -14513,6 +13637,7 @@
         </w:tabs>
         <w:ind w:start="2520" w:hanging="360"/>
       </w:pPr>
+      <w:rPr/>
     </w:lvl>
     <w:lvl w:ilvl="6">
       <w:start w:val="1"/>
@@ -14525,6 +13650,7 @@
         </w:tabs>
         <w:ind w:start="2880" w:hanging="360"/>
       </w:pPr>
+      <w:rPr/>
     </w:lvl>
     <w:lvl w:ilvl="7">
       <w:start w:val="1"/>
@@ -14537,6 +13663,7 @@
         </w:tabs>
         <w:ind w:start="3240" w:hanging="360"/>
       </w:pPr>
+      <w:rPr/>
     </w:lvl>
     <w:lvl w:ilvl="8">
       <w:start w:val="1"/>
@@ -14549,6 +13676,7 @@
         </w:tabs>
         <w:ind w:start="3600" w:hanging="360"/>
       </w:pPr>
+      <w:rPr/>
     </w:lvl>
   </w:abstractNum>
   <w:abstractNum w:abstractNumId="22">
@@ -14578,6 +13706,7 @@
         </w:tabs>
         <w:ind w:start="1080" w:hanging="360"/>
       </w:pPr>
+      <w:rPr/>
     </w:lvl>
     <w:lvl w:ilvl="2">
       <w:start w:val="1"/>
@@ -14590,6 +13719,7 @@
         </w:tabs>
         <w:ind w:start="1440" w:hanging="360"/>
       </w:pPr>
+      <w:rPr/>
     </w:lvl>
     <w:lvl w:ilvl="3">
       <w:start w:val="1"/>
@@ -14602,6 +13732,7 @@
         </w:tabs>
         <w:ind w:start="1800" w:hanging="360"/>
       </w:pPr>
+      <w:rPr/>
     </w:lvl>
     <w:lvl w:ilvl="4">
       <w:start w:val="1"/>
@@ -14614,6 +13745,7 @@
         </w:tabs>
         <w:ind w:start="2160" w:hanging="360"/>
       </w:pPr>
+      <w:rPr/>
     </w:lvl>
     <w:lvl w:ilvl="5">
       <w:start w:val="1"/>
@@ -14626,6 +13758,7 @@
         </w:tabs>
         <w:ind w:start="2520" w:hanging="360"/>
       </w:pPr>
+      <w:rPr/>
     </w:lvl>
     <w:lvl w:ilvl="6">
       <w:start w:val="1"/>
@@ -14638,6 +13771,7 @@
         </w:tabs>
         <w:ind w:start="2880" w:hanging="360"/>
       </w:pPr>
+      <w:rPr/>
     </w:lvl>
     <w:lvl w:ilvl="7">
       <w:start w:val="1"/>
@@ -14650,6 +13784,7 @@
         </w:tabs>
         <w:ind w:start="3240" w:hanging="360"/>
       </w:pPr>
+      <w:rPr/>
     </w:lvl>
     <w:lvl w:ilvl="8">
       <w:start w:val="1"/>
@@ -14662,6 +13797,7 @@
         </w:tabs>
         <w:ind w:start="3600" w:hanging="360"/>
       </w:pPr>
+      <w:rPr/>
     </w:lvl>
   </w:abstractNum>
   <w:abstractNum w:abstractNumId="23">
@@ -14691,6 +13827,7 @@
         </w:tabs>
         <w:ind w:start="1080" w:hanging="360"/>
       </w:pPr>
+      <w:rPr/>
     </w:lvl>
     <w:lvl w:ilvl="2">
       <w:start w:val="1"/>
@@ -14703,6 +13840,7 @@
         </w:tabs>
         <w:ind w:start="1440" w:hanging="360"/>
       </w:pPr>
+      <w:rPr/>
     </w:lvl>
     <w:lvl w:ilvl="3">
       <w:start w:val="1"/>
@@ -14715,6 +13853,7 @@
         </w:tabs>
         <w:ind w:start="1800" w:hanging="360"/>
       </w:pPr>
+      <w:rPr/>
     </w:lvl>
     <w:lvl w:ilvl="4">
       <w:start w:val="1"/>
@@ -14727,6 +13866,7 @@
         </w:tabs>
         <w:ind w:start="2160" w:hanging="360"/>
       </w:pPr>
+      <w:rPr/>
     </w:lvl>
     <w:lvl w:ilvl="5">
       <w:start w:val="1"/>
@@ -14739,6 +13879,7 @@
         </w:tabs>
         <w:ind w:start="2520" w:hanging="360"/>
       </w:pPr>
+      <w:rPr/>
     </w:lvl>
     <w:lvl w:ilvl="6">
       <w:start w:val="1"/>
@@ -14751,6 +13892,7 @@
         </w:tabs>
         <w:ind w:start="2880" w:hanging="360"/>
       </w:pPr>
+      <w:rPr/>
     </w:lvl>
     <w:lvl w:ilvl="7">
       <w:start w:val="1"/>
@@ -14763,6 +13905,7 @@
         </w:tabs>
         <w:ind w:start="3240" w:hanging="360"/>
       </w:pPr>
+      <w:rPr/>
     </w:lvl>
     <w:lvl w:ilvl="8">
       <w:start w:val="1"/>
@@ -14775,6 +13918,7 @@
         </w:tabs>
         <w:ind w:start="3600" w:hanging="360"/>
       </w:pPr>
+      <w:rPr/>
     </w:lvl>
   </w:abstractNum>
   <w:abstractNum w:abstractNumId="24">
@@ -14804,6 +13948,7 @@
         </w:tabs>
         <w:ind w:start="1080" w:hanging="360"/>
       </w:pPr>
+      <w:rPr/>
     </w:lvl>
     <w:lvl w:ilvl="2">
       <w:start w:val="1"/>
@@ -14816,6 +13961,7 @@
         </w:tabs>
         <w:ind w:start="1440" w:hanging="360"/>
       </w:pPr>
+      <w:rPr/>
     </w:lvl>
     <w:lvl w:ilvl="3">
       <w:start w:val="1"/>
@@ -14828,6 +13974,7 @@
         </w:tabs>
         <w:ind w:start="1800" w:hanging="360"/>
       </w:pPr>
+      <w:rPr/>
     </w:lvl>
     <w:lvl w:ilvl="4">
       <w:start w:val="1"/>
@@ -14840,6 +13987,7 @@
         </w:tabs>
         <w:ind w:start="2160" w:hanging="360"/>
       </w:pPr>
+      <w:rPr/>
     </w:lvl>
     <w:lvl w:ilvl="5">
       <w:start w:val="1"/>
@@ -14852,6 +14000,7 @@
         </w:tabs>
         <w:ind w:start="2520" w:hanging="360"/>
       </w:pPr>
+      <w:rPr/>
     </w:lvl>
     <w:lvl w:ilvl="6">
       <w:start w:val="1"/>
@@ -14864,6 +14013,7 @@
         </w:tabs>
         <w:ind w:start="2880" w:hanging="360"/>
       </w:pPr>
+      <w:rPr/>
     </w:lvl>
     <w:lvl w:ilvl="7">
       <w:start w:val="1"/>
@@ -14876,6 +14026,7 @@
         </w:tabs>
         <w:ind w:start="3240" w:hanging="360"/>
       </w:pPr>
+      <w:rPr/>
     </w:lvl>
     <w:lvl w:ilvl="8">
       <w:start w:val="1"/>
@@ -14888,6 +14039,7 @@
         </w:tabs>
         <w:ind w:start="3600" w:hanging="360"/>
       </w:pPr>
+      <w:rPr/>
     </w:lvl>
   </w:abstractNum>
   <w:abstractNum w:abstractNumId="25">
@@ -14917,6 +14069,7 @@
         </w:tabs>
         <w:ind w:start="1080" w:hanging="360"/>
       </w:pPr>
+      <w:rPr/>
     </w:lvl>
     <w:lvl w:ilvl="2">
       <w:start w:val="1"/>
@@ -14929,6 +14082,7 @@
         </w:tabs>
         <w:ind w:start="1440" w:hanging="360"/>
       </w:pPr>
+      <w:rPr/>
     </w:lvl>
     <w:lvl w:ilvl="3">
       <w:start w:val="1"/>
@@ -14941,6 +14095,7 @@
         </w:tabs>
         <w:ind w:start="1800" w:hanging="360"/>
       </w:pPr>
+      <w:rPr/>
     </w:lvl>
     <w:lvl w:ilvl="4">
       <w:start w:val="1"/>
@@ -14953,6 +14108,7 @@
         </w:tabs>
         <w:ind w:start="2160" w:hanging="360"/>
       </w:pPr>
+      <w:rPr/>
     </w:lvl>
     <w:lvl w:ilvl="5">
       <w:start w:val="1"/>
@@ -14965,6 +14121,7 @@
         </w:tabs>
         <w:ind w:start="2520" w:hanging="360"/>
       </w:pPr>
+      <w:rPr/>
     </w:lvl>
     <w:lvl w:ilvl="6">
       <w:start w:val="1"/>
@@ -14977,6 +14134,7 @@
         </w:tabs>
         <w:ind w:start="2880" w:hanging="360"/>
       </w:pPr>
+      <w:rPr/>
     </w:lvl>
     <w:lvl w:ilvl="7">
       <w:start w:val="1"/>
@@ -14989,6 +14147,7 @@
         </w:tabs>
         <w:ind w:start="3240" w:hanging="360"/>
       </w:pPr>
+      <w:rPr/>
     </w:lvl>
     <w:lvl w:ilvl="8">
       <w:start w:val="1"/>
@@ -15001,6 +14160,7 @@
         </w:tabs>
         <w:ind w:start="3600" w:hanging="360"/>
       </w:pPr>
+      <w:rPr/>
     </w:lvl>
   </w:abstractNum>
   <w:abstractNum w:abstractNumId="26">

</xml_diff>

<commit_message>
Atualizado arquivos de gestao de testes
</commit_message>
<xml_diff>
--- a/arquivos/Gestão de Testes/Planejamento e Estrategia de Testes.docx
+++ b/arquivos/Gestão de Testes/Planejamento e Estrategia de Testes.docx
@@ -829,16 +829,16 @@
         </w:tblCellMar>
       </w:tblPr>
       <w:tblGrid>
-        <w:gridCol w:w="2301"/>
-        <w:gridCol w:w="1154"/>
-        <w:gridCol w:w="3747"/>
-        <w:gridCol w:w="2301"/>
+        <w:gridCol w:w="2300"/>
+        <w:gridCol w:w="1155"/>
+        <w:gridCol w:w="3748"/>
+        <w:gridCol w:w="2300"/>
       </w:tblGrid>
       <w:tr>
         <w:trPr/>
         <w:tc>
           <w:tcPr>
-            <w:tcW w:w="2301" w:type="dxa"/>
+            <w:tcW w:w="2300" w:type="dxa"/>
             <w:tcBorders>
               <w:top w:val="single" w:sz="6" w:space="0" w:color="000000"/>
               <w:start w:val="single" w:sz="6" w:space="0" w:color="000000"/>
@@ -867,7 +867,7 @@
         </w:tc>
         <w:tc>
           <w:tcPr>
-            <w:tcW w:w="1154" w:type="dxa"/>
+            <w:tcW w:w="1155" w:type="dxa"/>
             <w:tcBorders>
               <w:top w:val="single" w:sz="6" w:space="0" w:color="000000"/>
               <w:start w:val="single" w:sz="6" w:space="0" w:color="000000"/>
@@ -896,7 +896,7 @@
         </w:tc>
         <w:tc>
           <w:tcPr>
-            <w:tcW w:w="3747" w:type="dxa"/>
+            <w:tcW w:w="3748" w:type="dxa"/>
             <w:tcBorders>
               <w:top w:val="single" w:sz="6" w:space="0" w:color="000000"/>
               <w:start w:val="single" w:sz="6" w:space="0" w:color="000000"/>
@@ -925,7 +925,7 @@
         </w:tc>
         <w:tc>
           <w:tcPr>
-            <w:tcW w:w="2301" w:type="dxa"/>
+            <w:tcW w:w="2300" w:type="dxa"/>
             <w:tcBorders>
               <w:top w:val="single" w:sz="6" w:space="0" w:color="000000"/>
               <w:start w:val="single" w:sz="6" w:space="0" w:color="000000"/>
@@ -957,7 +957,7 @@
         <w:trPr/>
         <w:tc>
           <w:tcPr>
-            <w:tcW w:w="2301" w:type="dxa"/>
+            <w:tcW w:w="2300" w:type="dxa"/>
             <w:tcBorders>
               <w:top w:val="single" w:sz="6" w:space="0" w:color="000000"/>
               <w:start w:val="single" w:sz="6" w:space="0" w:color="000000"/>
@@ -983,7 +983,7 @@
         </w:tc>
         <w:tc>
           <w:tcPr>
-            <w:tcW w:w="1154" w:type="dxa"/>
+            <w:tcW w:w="1155" w:type="dxa"/>
             <w:tcBorders>
               <w:top w:val="single" w:sz="6" w:space="0" w:color="000000"/>
               <w:start w:val="single" w:sz="6" w:space="0" w:color="000000"/>
@@ -1009,7 +1009,7 @@
         </w:tc>
         <w:tc>
           <w:tcPr>
-            <w:tcW w:w="3747" w:type="dxa"/>
+            <w:tcW w:w="3748" w:type="dxa"/>
             <w:tcBorders>
               <w:top w:val="single" w:sz="6" w:space="0" w:color="000000"/>
               <w:start w:val="single" w:sz="6" w:space="0" w:color="000000"/>
@@ -1035,7 +1035,7 @@
         </w:tc>
         <w:tc>
           <w:tcPr>
-            <w:tcW w:w="2301" w:type="dxa"/>
+            <w:tcW w:w="2300" w:type="dxa"/>
             <w:tcBorders>
               <w:top w:val="single" w:sz="6" w:space="0" w:color="000000"/>
               <w:start w:val="single" w:sz="6" w:space="0" w:color="000000"/>
@@ -8156,8 +8156,8 @@
       </w:tblPr>
       <w:tblGrid>
         <w:gridCol w:w="3059"/>
-        <w:gridCol w:w="2357"/>
-        <w:gridCol w:w="3197"/>
+        <w:gridCol w:w="2356"/>
+        <w:gridCol w:w="3198"/>
       </w:tblGrid>
       <w:tr>
         <w:trPr/>
@@ -8191,7 +8191,7 @@
         </w:tc>
         <w:tc>
           <w:tcPr>
-            <w:tcW w:w="2357" w:type="dxa"/>
+            <w:tcW w:w="2356" w:type="dxa"/>
             <w:tcBorders>
               <w:top w:val="single" w:sz="12" w:space="0" w:color="000000"/>
               <w:start w:val="single" w:sz="6" w:space="0" w:color="000000"/>
@@ -8220,7 +8220,7 @@
         </w:tc>
         <w:tc>
           <w:tcPr>
-            <w:tcW w:w="3197" w:type="dxa"/>
+            <w:tcW w:w="3198" w:type="dxa"/>
             <w:tcBorders>
               <w:top w:val="single" w:sz="12" w:space="0" w:color="000000"/>
               <w:start w:val="single" w:sz="6" w:space="0" w:color="000000"/>
@@ -8279,7 +8279,7 @@
         </w:tc>
         <w:tc>
           <w:tcPr>
-            <w:tcW w:w="2357" w:type="dxa"/>
+            <w:tcW w:w="2356" w:type="dxa"/>
             <w:tcBorders>
               <w:start w:val="single" w:sz="6" w:space="0" w:color="000000"/>
               <w:bottom w:val="single" w:sz="6" w:space="0" w:color="000000"/>
@@ -8305,7 +8305,7 @@
         </w:tc>
         <w:tc>
           <w:tcPr>
-            <w:tcW w:w="3197" w:type="dxa"/>
+            <w:tcW w:w="3198" w:type="dxa"/>
             <w:tcBorders>
               <w:start w:val="single" w:sz="6" w:space="0" w:color="000000"/>
               <w:bottom w:val="single" w:sz="6" w:space="0" w:color="000000"/>
@@ -8364,7 +8364,7 @@
         </w:tc>
         <w:tc>
           <w:tcPr>
-            <w:tcW w:w="2357" w:type="dxa"/>
+            <w:tcW w:w="2356" w:type="dxa"/>
             <w:tcBorders>
               <w:top w:val="single" w:sz="6" w:space="0" w:color="000000"/>
               <w:start w:val="single" w:sz="6" w:space="0" w:color="000000"/>
@@ -8393,7 +8393,7 @@
         </w:tc>
         <w:tc>
           <w:tcPr>
-            <w:tcW w:w="3197" w:type="dxa"/>
+            <w:tcW w:w="3198" w:type="dxa"/>
             <w:tcBorders>
               <w:top w:val="single" w:sz="6" w:space="0" w:color="000000"/>
               <w:start w:val="single" w:sz="6" w:space="0" w:color="000000"/>
@@ -8453,7 +8453,7 @@
         </w:tc>
         <w:tc>
           <w:tcPr>
-            <w:tcW w:w="2357" w:type="dxa"/>
+            <w:tcW w:w="2356" w:type="dxa"/>
             <w:tcBorders>
               <w:top w:val="single" w:sz="6" w:space="0" w:color="000000"/>
               <w:start w:val="single" w:sz="6" w:space="0" w:color="000000"/>
@@ -8499,7 +8499,7 @@
         </w:tc>
         <w:tc>
           <w:tcPr>
-            <w:tcW w:w="3197" w:type="dxa"/>
+            <w:tcW w:w="3198" w:type="dxa"/>
             <w:tcBorders>
               <w:top w:val="single" w:sz="6" w:space="0" w:color="000000"/>
               <w:start w:val="single" w:sz="6" w:space="0" w:color="000000"/>
@@ -8559,7 +8559,7 @@
         </w:tc>
         <w:tc>
           <w:tcPr>
-            <w:tcW w:w="2357" w:type="dxa"/>
+            <w:tcW w:w="2356" w:type="dxa"/>
             <w:tcBorders>
               <w:top w:val="single" w:sz="6" w:space="0" w:color="000000"/>
               <w:start w:val="single" w:sz="6" w:space="0" w:color="000000"/>
@@ -8588,7 +8588,7 @@
         </w:tc>
         <w:tc>
           <w:tcPr>
-            <w:tcW w:w="3197" w:type="dxa"/>
+            <w:tcW w:w="3198" w:type="dxa"/>
             <w:tcBorders>
               <w:top w:val="single" w:sz="6" w:space="0" w:color="000000"/>
               <w:start w:val="single" w:sz="6" w:space="0" w:color="000000"/>
@@ -8648,7 +8648,7 @@
         </w:tc>
         <w:tc>
           <w:tcPr>
-            <w:tcW w:w="2357" w:type="dxa"/>
+            <w:tcW w:w="2356" w:type="dxa"/>
             <w:tcBorders>
               <w:start w:val="single" w:sz="6" w:space="0" w:color="000000"/>
               <w:bottom w:val="single" w:sz="12" w:space="0" w:color="000000"/>
@@ -8676,7 +8676,7 @@
         </w:tc>
         <w:tc>
           <w:tcPr>
-            <w:tcW w:w="3197" w:type="dxa"/>
+            <w:tcW w:w="3198" w:type="dxa"/>
             <w:tcBorders>
               <w:start w:val="single" w:sz="6" w:space="0" w:color="000000"/>
               <w:bottom w:val="single" w:sz="12" w:space="0" w:color="000000"/>

</xml_diff>